<commit_message>
Breid verslag klantgesprek Anouar uit naar 4 pagina's
Co-Authored-By: Claude Opus 5.5 <noreply@anthropic.com>
Claude-Session: https://claude.ai/code/session_01EPbmVSJZpU3ZYgYyjANTDJ
</commit_message>
<xml_diff>
--- a/Verslag_klantgesprek_Anouar.docx
+++ b/Verslag_klantgesprek_Anouar.docx
@@ -12,7 +12,25 @@
     </w:p>
     <w:p>
       <w:pPr>
-        <w:spacing w:after="240"/>
+        <w:spacing w:after="140" w:line="288"/>
+        <w:rPr>
+          <w:color w:val="1F2A44"/>
+          <w:sz w:val="26"/>
+          <w:szCs w:val="26"/>
+        </w:rPr>
+      </w:pPr>
+      <w:r>
+        <w:rPr>
+          <w:color w:val="1F2A44"/>
+          <w:sz w:val="26"/>
+          <w:szCs w:val="26"/>
+        </w:rPr>
+        <w:t xml:space="preserve">Zelfreflectie en verbeterplan</w:t>
+      </w:r>
+    </w:p>
+    <w:p>
+      <w:pPr>
+        <w:spacing w:after="280"/>
         <w:rPr>
           <w:color w:val="666666"/>
         </w:rPr>
@@ -29,31 +47,39 @@
         <w:pStyle w:val="Heading2"/>
       </w:pPr>
       <w:r>
-        <w:t xml:space="preserve">Context</w:t>
-      </w:r>
-    </w:p>
-    <w:p>
-      <w:pPr>
-        <w:spacing w:after="120"/>
-      </w:pPr>
-      <w:r>
-        <w:t xml:space="preserve">Het gesprek met Anouar liep niet goed. Hij gaf mij vertrouwen. Ik gaf hem geen aandacht terug.</w:t>
-      </w:r>
-    </w:p>
-    <w:p>
-      <w:pPr>
-        <w:spacing w:after="120"/>
-      </w:pPr>
-      <w:r>
-        <w:t xml:space="preserve">Anouar vertelde over zijn slechte ervaring met zijn vorige accountant, Swiftnine. Hij gaf aan dat een accountant hem eerder verkeerd advies heeft gegeven.</w:t>
-      </w:r>
-    </w:p>
-    <w:p>
-      <w:pPr>
-        <w:spacing w:after="120"/>
-      </w:pPr>
-      <w:r>
-        <w:t xml:space="preserve">Dat was het belangrijkste moment van het gesprek. Daar liet hij zien wat hij nodig heeft: iemand die luistert en die hij kan vertrouwen.</w:t>
+        <w:t xml:space="preserve">Samenvatting</w:t>
+      </w:r>
+    </w:p>
+    <w:p>
+      <w:pPr>
+        <w:spacing w:after="140" w:line="288"/>
+      </w:pPr>
+      <w:r>
+        <w:t xml:space="preserve">Het gesprek met Anouar is niet goed verlopen. Hij gaf mij vertrouwen. Ik gaf hem geen aandacht terug.</w:t>
+      </w:r>
+    </w:p>
+    <w:p>
+      <w:pPr>
+        <w:spacing w:after="140" w:line="288"/>
+      </w:pPr>
+      <w:r>
+        <w:t xml:space="preserve">Hij vertelde over een slechte ervaring met zijn vorige accountant en over verkeerd advies. Dat was het moment om te luisteren en medeleven te tonen. Dat heb ik niet gedaan.</w:t>
+      </w:r>
+    </w:p>
+    <w:p>
+      <w:pPr>
+        <w:spacing w:after="140" w:line="288"/>
+      </w:pPr>
+      <w:r>
+        <w:t xml:space="preserve">Daarnaast herhaalde ik mezelf, toonde ik geen interesse in hem, vielen er stiltes omdat ik met de pc bezig was en was mijn houding niet professioneel.</w:t>
+      </w:r>
+    </w:p>
+    <w:p>
+      <w:pPr>
+        <w:spacing w:after="140" w:line="288"/>
+      </w:pPr>
+      <w:r>
+        <w:t xml:space="preserve">Dit verslag beschrijft wat er misging, waarom dat telt en wat ik in de volgende gesprekken anders doe.</w:t>
       </w:r>
     </w:p>
     <w:p>
@@ -61,7 +87,102 @@
         <w:pStyle w:val="Heading2"/>
       </w:pPr>
       <w:r>
-        <w:t xml:space="preserve">Wat ging er mis</w:t>
+        <w:t xml:space="preserve">Doel van dit verslag</w:t>
+      </w:r>
+    </w:p>
+    <w:p>
+      <w:pPr>
+        <w:spacing w:after="140" w:line="288"/>
+      </w:pPr>
+      <w:r>
+        <w:t xml:space="preserve">Ik wil eerlijk terugkijken op dit gesprek. Niet om mezelf af te kraken, maar om ervan te leren.</w:t>
+      </w:r>
+    </w:p>
+    <w:p>
+      <w:pPr>
+        <w:spacing w:after="140" w:line="288"/>
+      </w:pPr>
+      <w:r>
+        <w:t xml:space="preserve">Een eerste gesprek bepaalt of een klant ons vertrouwt. Zeker een klant die al eerder is teleurgesteld. Daarom wil ik concreet maken wat ik moet veranderen, zodat dit niet opnieuw gebeurt.</w:t>
+      </w:r>
+    </w:p>
+    <w:p>
+      <w:pPr>
+        <w:pStyle w:val="Heading2"/>
+      </w:pPr>
+      <w:r>
+        <w:t xml:space="preserve">Context van het gesprek</w:t>
+      </w:r>
+    </w:p>
+    <w:p>
+      <w:pPr>
+        <w:spacing w:after="140" w:line="288"/>
+      </w:pPr>
+      <w:r>
+        <w:t xml:space="preserve">Anouar kwam met een duidelijke achtergrond. Hij had een slechte ervaring met zijn vorige accountant, Swiftnine. Daarnaast gaf hij aan dat een accountant hem eerder geen goed advies heeft gegeven.</w:t>
+      </w:r>
+    </w:p>
+    <w:p>
+      <w:pPr>
+        <w:spacing w:after="140" w:line="288"/>
+      </w:pPr>
+      <w:r>
+        <w:t xml:space="preserve">Daarmee zei hij eigenlijk al wat hij zoekt:</w:t>
+      </w:r>
+    </w:p>
+    <w:p>
+      <w:pPr>
+        <w:pStyle w:val="ListParagraph"/>
+        <w:numPr>
+          <w:ilvl w:val="0"/>
+          <w:numId w:val="2"/>
+        </w:numPr>
+        <w:spacing w:after="80" w:line="276"/>
+      </w:pPr>
+      <w:r>
+        <w:t xml:space="preserve">een accountant die luistert;</w:t>
+      </w:r>
+    </w:p>
+    <w:p>
+      <w:pPr>
+        <w:pStyle w:val="ListParagraph"/>
+        <w:numPr>
+          <w:ilvl w:val="0"/>
+          <w:numId w:val="2"/>
+        </w:numPr>
+        <w:spacing w:after="80" w:line="276"/>
+      </w:pPr>
+      <w:r>
+        <w:t xml:space="preserve">advies waar hij op kan bouwen;</w:t>
+      </w:r>
+    </w:p>
+    <w:p>
+      <w:pPr>
+        <w:pStyle w:val="ListParagraph"/>
+        <w:numPr>
+          <w:ilvl w:val="0"/>
+          <w:numId w:val="2"/>
+        </w:numPr>
+        <w:spacing w:after="80" w:line="276"/>
+      </w:pPr>
+      <w:r>
+        <w:t xml:space="preserve">iemand die hem serieus neemt en betrokken is.</w:t>
+      </w:r>
+    </w:p>
+    <w:p>
+      <w:pPr>
+        <w:spacing w:after="140" w:line="288"/>
+      </w:pPr>
+      <w:r>
+        <w:t xml:space="preserve">Dat was het belangrijkste moment van het gesprek. Hier had ik het verschil kunnen maken. Juist daar schoot ik tekort.</w:t>
+      </w:r>
+    </w:p>
+    <w:p>
+      <w:pPr>
+        <w:pStyle w:val="Heading2"/>
+      </w:pPr>
+      <w:r>
+        <w:t xml:space="preserve">Overzicht: wat ging er mis</w:t>
       </w:r>
     </w:p>
     <w:tbl>
@@ -83,6 +204,7 @@
       </w:tblGrid>
       <w:tr>
         <w:trPr>
+          <w:cantSplit/>
           <w:tblHeader/>
         </w:trPr>
         <w:tc>
@@ -172,6 +294,7 @@
       </w:tr>
       <w:tr>
         <w:trPr>
+          <w:cantSplit/>
           <w:tblHeader w:val="false"/>
         </w:trPr>
         <w:tc>
@@ -256,6 +379,7 @@
       </w:tr>
       <w:tr>
         <w:trPr>
+          <w:cantSplit/>
           <w:tblHeader w:val="false"/>
         </w:trPr>
         <w:tc>
@@ -340,6 +464,7 @@
       </w:tr>
       <w:tr>
         <w:trPr>
+          <w:cantSplit/>
           <w:tblHeader w:val="false"/>
         </w:trPr>
         <w:tc>
@@ -424,6 +549,7 @@
       </w:tr>
       <w:tr>
         <w:trPr>
+          <w:cantSplit/>
           <w:tblHeader w:val="false"/>
         </w:trPr>
         <w:tc>
@@ -508,6 +634,7 @@
       </w:tr>
       <w:tr>
         <w:trPr>
+          <w:cantSplit/>
           <w:tblHeader w:val="false"/>
         </w:trPr>
         <w:tc>
@@ -596,12 +723,22 @@
         <w:pStyle w:val="Heading2"/>
       </w:pPr>
       <w:r>
-        <w:t xml:space="preserve">Wat had beter gekund</w:t>
-      </w:r>
-    </w:p>
-    <w:p>
-      <w:pPr>
-        <w:spacing w:after="140"/>
+        <w:t xml:space="preserve">Analyse per punt</w:t>
+      </w:r>
+    </w:p>
+    <w:p>
+      <w:pPr>
+        <w:pStyle w:val="Heading3"/>
+        <w:keepNext/>
+        <w:keepLines/>
+      </w:pPr>
+      <w:r>
+        <w:t xml:space="preserve">1. Herhalen</w:t>
+      </w:r>
+    </w:p>
+    <w:p>
+      <w:pPr>
+        <w:spacing w:after="120" w:line="288"/>
       </w:pPr>
       <w:r>
         <w:rPr>
@@ -609,15 +746,15 @@
           <w:bCs/>
           <w:color w:val="1F2A44"/>
         </w:rPr>
-        <w:t xml:space="preserve">Meer luisteren. </w:t>
-      </w:r>
-      <w:r>
-        <w:t xml:space="preserve">Ik had Anouar laten uitpraten en doorgevraagd. Bijvoorbeeld: "Wat ging er precies mis bij Swiftnine?" en "Welk advies had je toen nodig?"</w:t>
-      </w:r>
-    </w:p>
-    <w:p>
-      <w:pPr>
-        <w:spacing w:after="140"/>
+        <w:t xml:space="preserve">Wat er gebeurde. </w:t>
+      </w:r>
+      <w:r>
+        <w:t xml:space="preserve">Ik zei dezelfde dingen 2 tot 3 keer. Niet omdat het nodig was, maar omdat ik mijn verhaal niet scherp had.</w:t>
+      </w:r>
+    </w:p>
+    <w:p>
+      <w:pPr>
+        <w:spacing w:after="120" w:line="288"/>
       </w:pPr>
       <w:r>
         <w:rPr>
@@ -625,15 +762,15 @@
           <w:bCs/>
           <w:color w:val="1F2A44"/>
         </w:rPr>
-        <w:t xml:space="preserve">Medeleven tonen. </w:t>
-      </w:r>
-      <w:r>
-        <w:t xml:space="preserve">Toen hij zich opende, had ik moeten erkennen wat hij meemaakte. Bijvoorbeeld: "Dat is vervelend. Je rekent op goed advies en dan krijg je het niet." Pas daarna had ik verder moeten gaan.</w:t>
-      </w:r>
-    </w:p>
-    <w:p>
-      <w:pPr>
-        <w:spacing w:after="140"/>
+        <w:t xml:space="preserve">Waarom dit telt. </w:t>
+      </w:r>
+      <w:r>
+        <w:t xml:space="preserve">Herhaling kost aandacht. De klant haakt af. Het wekt de indruk dat ik niet goed voorbereid ben, of dat ik niet luister naar wat hij al begrepen heeft. Voor iemand die op zoek is naar een betrouwbare accountant is dat precies het verkeerde signaal.</w:t>
+      </w:r>
+    </w:p>
+    <w:p>
+      <w:pPr>
+        <w:spacing w:after="120" w:line="288"/>
       </w:pPr>
       <w:r>
         <w:rPr>
@@ -641,31 +778,21 @@
           <w:bCs/>
           <w:color w:val="1F2A44"/>
         </w:rPr>
-        <w:t xml:space="preserve">Interesse tonen. </w:t>
-      </w:r>
-      <w:r>
-        <w:t xml:space="preserve">Ik had vragen moeten stellen over hem, zijn bedrijf en zijn plannen. Hij moet voelen dat het om hem draait.</w:t>
-      </w:r>
-    </w:p>
-    <w:p>
-      <w:pPr>
-        <w:spacing w:after="140"/>
-      </w:pPr>
-      <w:r>
+        <w:t xml:space="preserve">Wat beter kon. </w:t>
+      </w:r>
+      <w:r>
+        <w:t xml:space="preserve">Vooraf drie kernpunten bepalen. Elk punt één keer helder brengen. Daarna checken of het overkomt, in plaats van het opnieuw te zeggen.</w:t>
+      </w:r>
+    </w:p>
+    <w:p>
+      <w:pPr>
+        <w:keepNext/>
+        <w:spacing w:after="60"/>
         <w:rPr>
           <w:b/>
           <w:bCs/>
           <w:color w:val="1F2A44"/>
         </w:rPr>
-        <w:t xml:space="preserve">Een praatje maken. </w:t>
-      </w:r>
-      <w:r>
-        <w:t xml:space="preserve">Een gesprek begint met contact, niet met een scherm. Ik had het gesprek gaande moeten houden in plaats van stil achter de pc te zitten.</w:t>
-      </w:r>
-    </w:p>
-    <w:p>
-      <w:pPr>
-        <w:spacing w:after="140"/>
       </w:pPr>
       <w:r>
         <w:rPr>
@@ -673,15 +800,38 @@
           <w:bCs/>
           <w:color w:val="1F2A44"/>
         </w:rPr>
-        <w:t xml:space="preserve">Eén keer, helder zeggen. </w:t>
-      </w:r>
-      <w:r>
-        <w:t xml:space="preserve">Ik had mijn punten vooraf moeten ordenen. Dan zeg ik iets één keer, duidelijk, en hoef ik het niet te herhalen.</w:t>
-      </w:r>
-    </w:p>
-    <w:p>
-      <w:pPr>
-        <w:spacing w:after="140"/>
+        <w:t xml:space="preserve">Voorbeeld:</w:t>
+      </w:r>
+    </w:p>
+    <w:p>
+      <w:pPr>
+        <w:pBdr>
+          <w:left w:val="single" w:color="1F2A44" w:sz="18" w:space="10"/>
+        </w:pBdr>
+        <w:spacing w:after="100" w:line="288"/>
+        <w:ind w:left="360"/>
+      </w:pPr>
+      <w:r>
+        <w:rPr>
+          <w:i/>
+          <w:iCs/>
+        </w:rPr>
+        <w:t xml:space="preserve">"Klopt het zo voor jou, of wil je dat ik iets verder uitleg?"</w:t>
+      </w:r>
+    </w:p>
+    <w:p>
+      <w:pPr>
+        <w:pStyle w:val="Heading3"/>
+        <w:keepNext/>
+        <w:keepLines/>
+      </w:pPr>
+      <w:r>
+        <w:t xml:space="preserve">2. Geen medeleven getoond</w:t>
+      </w:r>
+    </w:p>
+    <w:p>
+      <w:pPr>
+        <w:spacing w:after="120" w:line="288"/>
       </w:pPr>
       <w:r>
         <w:rPr>
@@ -689,10 +839,322 @@
           <w:bCs/>
           <w:color w:val="1F2A44"/>
         </w:rPr>
-        <w:t xml:space="preserve">Professionele houding. </w:t>
-      </w:r>
-      <w:r>
-        <w:t xml:space="preserve">Rechtop zitten. Oogcontact. Naar hem toe gericht. Laptop alleen open als het nodig is.</w:t>
+        <w:t xml:space="preserve">Wat er gebeurde. </w:t>
+      </w:r>
+      <w:r>
+        <w:t xml:space="preserve">Anouar opende zich. Hij vertelde over zijn slechte ervaring met Swiftnine en over een accountant die hem verkeerd advies gaf. Ik reageerde daar niet op. Ik ging verder alsof het niet gezegd was.</w:t>
+      </w:r>
+    </w:p>
+    <w:p>
+      <w:pPr>
+        <w:spacing w:after="120" w:line="288"/>
+      </w:pPr>
+      <w:r>
+        <w:rPr>
+          <w:b/>
+          <w:bCs/>
+          <w:color w:val="1F2A44"/>
+        </w:rPr>
+        <w:t xml:space="preserve">Waarom dit telt. </w:t>
+      </w:r>
+      <w:r>
+        <w:t xml:space="preserve">Op zo’n moment toont een klant zijn zorg. Wie dat negeert, bevestigt die zorg: weer een accountant die niet luistert. Erkenning kost tien seconden en bouwt meer vertrouwen dan elke uitleg over onze dienstverlening.</w:t>
+      </w:r>
+    </w:p>
+    <w:p>
+      <w:pPr>
+        <w:spacing w:after="120" w:line="288"/>
+      </w:pPr>
+      <w:r>
+        <w:rPr>
+          <w:b/>
+          <w:bCs/>
+          <w:color w:val="1F2A44"/>
+        </w:rPr>
+        <w:t xml:space="preserve">Wat beter kon. </w:t>
+      </w:r>
+      <w:r>
+        <w:t xml:space="preserve">Even stoppen. Benoemen wat hij heeft meegemaakt. Doorvragen. Pas daarna laten zien hoe wij het anders doen.</w:t>
+      </w:r>
+    </w:p>
+    <w:p>
+      <w:pPr>
+        <w:keepNext/>
+        <w:spacing w:after="60"/>
+        <w:rPr>
+          <w:b/>
+          <w:bCs/>
+          <w:color w:val="1F2A44"/>
+        </w:rPr>
+      </w:pPr>
+      <w:r>
+        <w:rPr>
+          <w:b/>
+          <w:bCs/>
+          <w:color w:val="1F2A44"/>
+        </w:rPr>
+        <w:t xml:space="preserve">Voorbeeld:</w:t>
+      </w:r>
+    </w:p>
+    <w:p>
+      <w:pPr>
+        <w:pBdr>
+          <w:left w:val="single" w:color="1F2A44" w:sz="18" w:space="10"/>
+        </w:pBdr>
+        <w:spacing w:after="100" w:line="288"/>
+        <w:ind w:left="360"/>
+      </w:pPr>
+      <w:r>
+        <w:rPr>
+          <w:i/>
+          <w:iCs/>
+        </w:rPr>
+        <w:t xml:space="preserve">"Dat is vervelend. Je rekent op goed advies en dan krijg je het niet. Wat is daar precies misgegaan?"</w:t>
+      </w:r>
+    </w:p>
+    <w:p>
+      <w:pPr>
+        <w:pStyle w:val="Heading3"/>
+        <w:keepNext/>
+        <w:keepLines/>
+      </w:pPr>
+      <w:r>
+        <w:t xml:space="preserve">3. Geen interesse in de klant</w:t>
+      </w:r>
+    </w:p>
+    <w:p>
+      <w:pPr>
+        <w:spacing w:after="120" w:line="288"/>
+      </w:pPr>
+      <w:r>
+        <w:rPr>
+          <w:b/>
+          <w:bCs/>
+          <w:color w:val="1F2A44"/>
+        </w:rPr>
+        <w:t xml:space="preserve">Wat er gebeurde. </w:t>
+      </w:r>
+      <w:r>
+        <w:t xml:space="preserve">Ik stelde geen vragen over Anouar, zijn bedrijf of zijn plannen. Het gesprek ging vooral over wat ik wilde vertellen.</w:t>
+      </w:r>
+    </w:p>
+    <w:p>
+      <w:pPr>
+        <w:spacing w:after="120" w:line="288"/>
+      </w:pPr>
+      <w:r>
+        <w:rPr>
+          <w:b/>
+          <w:bCs/>
+          <w:color w:val="1F2A44"/>
+        </w:rPr>
+        <w:t xml:space="preserve">Waarom dit telt. </w:t>
+      </w:r>
+      <w:r>
+        <w:t xml:space="preserve">Een klant wil voelen dat het om hem draait. Zonder vragen weet ik ook niet wat hij nodig heeft. Dan kan ik geen passend advies geven en blijft mijn verhaal algemeen.</w:t>
+      </w:r>
+    </w:p>
+    <w:p>
+      <w:pPr>
+        <w:spacing w:after="120" w:line="288"/>
+      </w:pPr>
+      <w:r>
+        <w:rPr>
+          <w:b/>
+          <w:bCs/>
+          <w:color w:val="1F2A44"/>
+        </w:rPr>
+        <w:t xml:space="preserve">Wat beter kon. </w:t>
+      </w:r>
+      <w:r>
+        <w:t xml:space="preserve">Beginnen bij hem. Open vragen stellen over zijn bedrijf, zijn doelen en wat hij van een accountant verwacht. Luisteren en daarop inhaken.</w:t>
+      </w:r>
+    </w:p>
+    <w:p>
+      <w:pPr>
+        <w:keepNext/>
+        <w:spacing w:after="60"/>
+        <w:rPr>
+          <w:b/>
+          <w:bCs/>
+          <w:color w:val="1F2A44"/>
+        </w:rPr>
+      </w:pPr>
+      <w:r>
+        <w:rPr>
+          <w:b/>
+          <w:bCs/>
+          <w:color w:val="1F2A44"/>
+        </w:rPr>
+        <w:t xml:space="preserve">Voorbeeld:</w:t>
+      </w:r>
+    </w:p>
+    <w:p>
+      <w:pPr>
+        <w:pBdr>
+          <w:left w:val="single" w:color="1F2A44" w:sz="18" w:space="10"/>
+        </w:pBdr>
+        <w:spacing w:after="100" w:line="288"/>
+        <w:ind w:left="360"/>
+      </w:pPr>
+      <w:r>
+        <w:rPr>
+          <w:i/>
+          <w:iCs/>
+        </w:rPr>
+        <w:t xml:space="preserve">"Vertel eens, waar sta je nu met je bedrijf en waar wil je over een jaar staan?"</w:t>
+      </w:r>
+    </w:p>
+    <w:p>
+      <w:pPr>
+        <w:pStyle w:val="Heading3"/>
+        <w:keepNext/>
+        <w:keepLines/>
+        <w:pageBreakBefore/>
+      </w:pPr>
+      <w:r>
+        <w:t xml:space="preserve">4. Stiltes door de pc</w:t>
+      </w:r>
+    </w:p>
+    <w:p>
+      <w:pPr>
+        <w:spacing w:after="120" w:line="288"/>
+      </w:pPr>
+      <w:r>
+        <w:rPr>
+          <w:b/>
+          <w:bCs/>
+          <w:color w:val="1F2A44"/>
+        </w:rPr>
+        <w:t xml:space="preserve">Wat er gebeurde. </w:t>
+      </w:r>
+      <w:r>
+        <w:t xml:space="preserve">Er vielen veel stiltes. Ik was bezig met de pc in plaats van met het gesprek. Ik had eigenlijk gewoon een praatje moeten maken.</w:t>
+      </w:r>
+    </w:p>
+    <w:p>
+      <w:pPr>
+        <w:spacing w:after="120" w:line="288"/>
+      </w:pPr>
+      <w:r>
+        <w:rPr>
+          <w:b/>
+          <w:bCs/>
+          <w:color w:val="1F2A44"/>
+        </w:rPr>
+        <w:t xml:space="preserve">Waarom dit telt. </w:t>
+      </w:r>
+      <w:r>
+        <w:t xml:space="preserve">Een scherm tussen mij en de klant zegt: iets anders is nu belangrijker. Stiltes die ik veroorzaak voelen ongemakkelijk en breken het contact. De klant blijft achter met het gevoel dat hij stoort.</w:t>
+      </w:r>
+    </w:p>
+    <w:p>
+      <w:pPr>
+        <w:spacing w:after="120" w:line="288"/>
+      </w:pPr>
+      <w:r>
+        <w:rPr>
+          <w:b/>
+          <w:bCs/>
+          <w:color w:val="1F2A44"/>
+        </w:rPr>
+        <w:t xml:space="preserve">Wat beter kon. </w:t>
+      </w:r>
+      <w:r>
+        <w:t xml:space="preserve">Laptop dicht tenzij ik iets moet laten zien. Als ik toch iets moet opzoeken: benoemen wat ik doe en het gesprek gaande houden. Een praatje maken hoort bij het werk, het is geen tijdverlies.</w:t>
+      </w:r>
+    </w:p>
+    <w:p>
+      <w:pPr>
+        <w:keepNext/>
+        <w:spacing w:after="60"/>
+        <w:rPr>
+          <w:b/>
+          <w:bCs/>
+          <w:color w:val="1F2A44"/>
+        </w:rPr>
+      </w:pPr>
+      <w:r>
+        <w:rPr>
+          <w:b/>
+          <w:bCs/>
+          <w:color w:val="1F2A44"/>
+        </w:rPr>
+        <w:t xml:space="preserve">Voorbeeld:</w:t>
+      </w:r>
+    </w:p>
+    <w:p>
+      <w:pPr>
+        <w:pBdr>
+          <w:left w:val="single" w:color="1F2A44" w:sz="18" w:space="10"/>
+        </w:pBdr>
+        <w:spacing w:after="100" w:line="288"/>
+        <w:ind w:left="360"/>
+      </w:pPr>
+      <w:r>
+        <w:rPr>
+          <w:i/>
+          <w:iCs/>
+        </w:rPr>
+        <w:t xml:space="preserve">"Ik zoek dit even voor je op. Hoe is het verder met de drukte deze periode?"</w:t>
+      </w:r>
+    </w:p>
+    <w:p>
+      <w:pPr>
+        <w:pStyle w:val="Heading3"/>
+        <w:keepNext/>
+        <w:keepLines/>
+      </w:pPr>
+      <w:r>
+        <w:t xml:space="preserve">5. Houding</w:t>
+      </w:r>
+    </w:p>
+    <w:p>
+      <w:pPr>
+        <w:spacing w:after="120" w:line="288"/>
+      </w:pPr>
+      <w:r>
+        <w:rPr>
+          <w:b/>
+          <w:bCs/>
+          <w:color w:val="1F2A44"/>
+        </w:rPr>
+        <w:t xml:space="preserve">Wat er gebeurde. </w:t>
+      </w:r>
+      <w:r>
+        <w:t xml:space="preserve">Mijn houding was niet netjes en niet open.</w:t>
+      </w:r>
+    </w:p>
+    <w:p>
+      <w:pPr>
+        <w:spacing w:after="120" w:line="288"/>
+      </w:pPr>
+      <w:r>
+        <w:rPr>
+          <w:b/>
+          <w:bCs/>
+          <w:color w:val="1F2A44"/>
+        </w:rPr>
+        <w:t xml:space="preserve">Waarom dit telt. </w:t>
+      </w:r>
+      <w:r>
+        <w:t xml:space="preserve">Lichaamstaal spreekt voordat ik iets zeg. Een onverschillige of slordige houding ondermijnt alles wat ik inhoudelijk vertel. Voor een kantoor dat autoriteit en betrouwbaarheid wil uitstralen weegt dit zwaar.</w:t>
+      </w:r>
+    </w:p>
+    <w:p>
+      <w:pPr>
+        <w:spacing w:after="120" w:line="288"/>
+      </w:pPr>
+      <w:r>
+        <w:rPr>
+          <w:b/>
+          <w:bCs/>
+          <w:color w:val="1F2A44"/>
+        </w:rPr>
+        <w:t xml:space="preserve">Wat beter kon. </w:t>
+      </w:r>
+      <w:r>
+        <w:t xml:space="preserve">Rechtop zitten. Naar de klant toe gericht. Oogcontact. Knikken en kort bevestigen als hij praat. Handen rustig, niet aan de muis of telefoon.</w:t>
       </w:r>
     </w:p>
     <w:p>
@@ -700,7 +1162,1333 @@
         <w:pStyle w:val="Heading2"/>
       </w:pPr>
       <w:r>
-        <w:t xml:space="preserve">Actiepunten voor volgende gesprekken</w:t>
+        <w:t xml:space="preserve">Wat ik hiervan leer</w:t>
+      </w:r>
+    </w:p>
+    <w:p>
+      <w:pPr>
+        <w:spacing w:after="140" w:line="288"/>
+      </w:pPr>
+      <w:r>
+        <w:t xml:space="preserve">Een klantgesprek gaat niet over wat ik wil vertellen. Het gaat over wat de klant nodig heeft.</w:t>
+      </w:r>
+    </w:p>
+    <w:p>
+      <w:pPr>
+        <w:spacing w:after="140" w:line="288"/>
+      </w:pPr>
+      <w:r>
+        <w:t xml:space="preserve">Luisteren is geen pauze tussen mijn zinnen. Het is het werk zelf. Wie goed luistert, hoeft minder te herhalen en geeft beter advies.</w:t>
+      </w:r>
+    </w:p>
+    <w:p>
+      <w:pPr>
+        <w:spacing w:after="140" w:line="288"/>
+      </w:pPr>
+      <w:r>
+        <w:t xml:space="preserve">Een klant die eerder is teleurgesteld, let extra scherp op. Elke stilte, elke herhaling en elke blik op het scherm telt dan dubbel.</w:t>
+      </w:r>
+    </w:p>
+    <w:p>
+      <w:pPr>
+        <w:spacing w:after="140" w:line="288"/>
+      </w:pPr>
+      <w:r>
+        <w:t xml:space="preserve">Vertrouwen begint niet bij onze expertise. Het begint bij aandacht.</w:t>
+      </w:r>
+    </w:p>
+    <w:p>
+      <w:pPr>
+        <w:pStyle w:val="Heading2"/>
+      </w:pPr>
+      <w:r>
+        <w:t xml:space="preserve">Opbouw van een goed klantgesprek</w:t>
+      </w:r>
+    </w:p>
+    <w:p>
+      <w:pPr>
+        <w:spacing w:after="140" w:line="288"/>
+      </w:pPr>
+      <w:r>
+        <w:t xml:space="preserve">Voor de volgende gesprekken houd ik deze opbouw aan:</w:t>
+      </w:r>
+    </w:p>
+    <w:tbl>
+      <w:tblPr>
+        <w:tblW w:type="dxa" w:w="9026"/>
+        <w:tblBorders>
+          <w:top w:val="single" w:color="auto" w:sz="4"/>
+          <w:left w:val="single" w:color="auto" w:sz="4"/>
+          <w:bottom w:val="single" w:color="auto" w:sz="4"/>
+          <w:right w:val="single" w:color="auto" w:sz="4"/>
+          <w:insideH w:val="single" w:color="auto" w:sz="4"/>
+          <w:insideV w:val="single" w:color="auto" w:sz="4"/>
+        </w:tblBorders>
+      </w:tblPr>
+      <w:tblGrid>
+        <w:gridCol w:w="2300"/>
+        <w:gridCol w:w="4426"/>
+        <w:gridCol w:w="2300"/>
+      </w:tblGrid>
+      <w:tr>
+        <w:trPr>
+          <w:cantSplit/>
+          <w:tblHeader/>
+        </w:trPr>
+        <w:tc>
+          <w:tcPr>
+            <w:tcW w:type="dxa" w:w="2300"/>
+            <w:tcBorders>
+              <w:top w:val="single" w:color="C9D1DC" w:sz="4"/>
+              <w:left w:val="single" w:color="C9D1DC" w:sz="4"/>
+              <w:bottom w:val="single" w:color="C9D1DC" w:sz="4"/>
+              <w:right w:val="single" w:color="C9D1DC" w:sz="4"/>
+            </w:tcBorders>
+            <w:shd w:fill="1F2A44" w:color="auto" w:val="clear"/>
+            <w:tcMar>
+              <w:top w:type="dxa" w:w="80"/>
+              <w:left w:type="dxa" w:w="120"/>
+              <w:bottom w:type="dxa" w:w="80"/>
+              <w:right w:type="dxa" w:w="120"/>
+            </w:tcMar>
+          </w:tcPr>
+          <w:p>
+            <w:r>
+              <w:rPr>
+                <w:b/>
+                <w:bCs/>
+                <w:color w:val="FFFFFF"/>
+              </w:rPr>
+              <w:t xml:space="preserve">Fase</w:t>
+            </w:r>
+          </w:p>
+        </w:tc>
+        <w:tc>
+          <w:tcPr>
+            <w:tcW w:type="dxa" w:w="4426"/>
+            <w:tcBorders>
+              <w:top w:val="single" w:color="C9D1DC" w:sz="4"/>
+              <w:left w:val="single" w:color="C9D1DC" w:sz="4"/>
+              <w:bottom w:val="single" w:color="C9D1DC" w:sz="4"/>
+              <w:right w:val="single" w:color="C9D1DC" w:sz="4"/>
+            </w:tcBorders>
+            <w:shd w:fill="1F2A44" w:color="auto" w:val="clear"/>
+            <w:tcMar>
+              <w:top w:type="dxa" w:w="80"/>
+              <w:left w:type="dxa" w:w="120"/>
+              <w:bottom w:type="dxa" w:w="80"/>
+              <w:right w:type="dxa" w:w="120"/>
+            </w:tcMar>
+          </w:tcPr>
+          <w:p>
+            <w:r>
+              <w:rPr>
+                <w:b/>
+                <w:bCs/>
+                <w:color w:val="FFFFFF"/>
+              </w:rPr>
+              <w:t xml:space="preserve">Wat ik doe</w:t>
+            </w:r>
+          </w:p>
+        </w:tc>
+        <w:tc>
+          <w:tcPr>
+            <w:tcW w:type="dxa" w:w="2300"/>
+            <w:tcBorders>
+              <w:top w:val="single" w:color="C9D1DC" w:sz="4"/>
+              <w:left w:val="single" w:color="C9D1DC" w:sz="4"/>
+              <w:bottom w:val="single" w:color="C9D1DC" w:sz="4"/>
+              <w:right w:val="single" w:color="C9D1DC" w:sz="4"/>
+            </w:tcBorders>
+            <w:shd w:fill="1F2A44" w:color="auto" w:val="clear"/>
+            <w:tcMar>
+              <w:top w:type="dxa" w:w="80"/>
+              <w:left w:type="dxa" w:w="120"/>
+              <w:bottom w:type="dxa" w:w="80"/>
+              <w:right w:type="dxa" w:w="120"/>
+            </w:tcMar>
+          </w:tcPr>
+          <w:p>
+            <w:r>
+              <w:rPr>
+                <w:b/>
+                <w:bCs/>
+                <w:color w:val="FFFFFF"/>
+              </w:rPr>
+              <w:t xml:space="preserve">Doel</w:t>
+            </w:r>
+          </w:p>
+        </w:tc>
+      </w:tr>
+      <w:tr>
+        <w:trPr>
+          <w:cantSplit/>
+          <w:tblHeader w:val="false"/>
+        </w:trPr>
+        <w:tc>
+          <w:tcPr>
+            <w:tcW w:type="dxa" w:w="2300"/>
+            <w:tcBorders>
+              <w:top w:val="single" w:color="C9D1DC" w:sz="4"/>
+              <w:left w:val="single" w:color="C9D1DC" w:sz="4"/>
+              <w:bottom w:val="single" w:color="C9D1DC" w:sz="4"/>
+              <w:right w:val="single" w:color="C9D1DC" w:sz="4"/>
+            </w:tcBorders>
+            <w:shd w:fill="E8ECF2" w:color="auto" w:val="clear"/>
+            <w:tcMar>
+              <w:top w:type="dxa" w:w="80"/>
+              <w:left w:type="dxa" w:w="120"/>
+              <w:bottom w:type="dxa" w:w="80"/>
+              <w:right w:type="dxa" w:w="120"/>
+            </w:tcMar>
+          </w:tcPr>
+          <w:p>
+            <w:r>
+              <w:rPr>
+                <w:b/>
+                <w:bCs/>
+              </w:rPr>
+              <w:t xml:space="preserve">1. Opening</w:t>
+            </w:r>
+          </w:p>
+        </w:tc>
+        <w:tc>
+          <w:tcPr>
+            <w:tcW w:type="dxa" w:w="4426"/>
+            <w:tcBorders>
+              <w:top w:val="single" w:color="C9D1DC" w:sz="4"/>
+              <w:left w:val="single" w:color="C9D1DC" w:sz="4"/>
+              <w:bottom w:val="single" w:color="C9D1DC" w:sz="4"/>
+              <w:right w:val="single" w:color="C9D1DC" w:sz="4"/>
+            </w:tcBorders>
+            <w:tcMar>
+              <w:top w:type="dxa" w:w="80"/>
+              <w:left w:type="dxa" w:w="120"/>
+              <w:bottom w:type="dxa" w:w="80"/>
+              <w:right w:type="dxa" w:w="120"/>
+            </w:tcMar>
+          </w:tcPr>
+          <w:p>
+            <w:r>
+              <w:rPr>
+                <w:b w:val="false"/>
+                <w:bCs w:val="false"/>
+              </w:rPr>
+              <w:t xml:space="preserve">Welkom, een kort praatje, laptop dicht. Rustig beginnen.</w:t>
+            </w:r>
+          </w:p>
+        </w:tc>
+        <w:tc>
+          <w:tcPr>
+            <w:tcW w:type="dxa" w:w="2300"/>
+            <w:tcBorders>
+              <w:top w:val="single" w:color="C9D1DC" w:sz="4"/>
+              <w:left w:val="single" w:color="C9D1DC" w:sz="4"/>
+              <w:bottom w:val="single" w:color="C9D1DC" w:sz="4"/>
+              <w:right w:val="single" w:color="C9D1DC" w:sz="4"/>
+            </w:tcBorders>
+            <w:tcMar>
+              <w:top w:type="dxa" w:w="80"/>
+              <w:left w:type="dxa" w:w="120"/>
+              <w:bottom w:type="dxa" w:w="80"/>
+              <w:right w:type="dxa" w:w="120"/>
+            </w:tcMar>
+          </w:tcPr>
+          <w:p>
+            <w:r>
+              <w:rPr>
+                <w:b w:val="false"/>
+                <w:bCs w:val="false"/>
+              </w:rPr>
+              <w:t xml:space="preserve">Contact maken</w:t>
+            </w:r>
+          </w:p>
+        </w:tc>
+      </w:tr>
+      <w:tr>
+        <w:trPr>
+          <w:cantSplit/>
+          <w:tblHeader w:val="false"/>
+        </w:trPr>
+        <w:tc>
+          <w:tcPr>
+            <w:tcW w:type="dxa" w:w="2300"/>
+            <w:tcBorders>
+              <w:top w:val="single" w:color="C9D1DC" w:sz="4"/>
+              <w:left w:val="single" w:color="C9D1DC" w:sz="4"/>
+              <w:bottom w:val="single" w:color="C9D1DC" w:sz="4"/>
+              <w:right w:val="single" w:color="C9D1DC" w:sz="4"/>
+            </w:tcBorders>
+            <w:shd w:fill="E8ECF2" w:color="auto" w:val="clear"/>
+            <w:tcMar>
+              <w:top w:type="dxa" w:w="80"/>
+              <w:left w:type="dxa" w:w="120"/>
+              <w:bottom w:type="dxa" w:w="80"/>
+              <w:right w:type="dxa" w:w="120"/>
+            </w:tcMar>
+          </w:tcPr>
+          <w:p>
+            <w:r>
+              <w:rPr>
+                <w:b/>
+                <w:bCs/>
+              </w:rPr>
+              <w:t xml:space="preserve">2. Verkennen</w:t>
+            </w:r>
+          </w:p>
+        </w:tc>
+        <w:tc>
+          <w:tcPr>
+            <w:tcW w:type="dxa" w:w="4426"/>
+            <w:tcBorders>
+              <w:top w:val="single" w:color="C9D1DC" w:sz="4"/>
+              <w:left w:val="single" w:color="C9D1DC" w:sz="4"/>
+              <w:bottom w:val="single" w:color="C9D1DC" w:sz="4"/>
+              <w:right w:val="single" w:color="C9D1DC" w:sz="4"/>
+            </w:tcBorders>
+            <w:tcMar>
+              <w:top w:type="dxa" w:w="80"/>
+              <w:left w:type="dxa" w:w="120"/>
+              <w:bottom w:type="dxa" w:w="80"/>
+              <w:right w:type="dxa" w:w="120"/>
+            </w:tcMar>
+          </w:tcPr>
+          <w:p>
+            <w:r>
+              <w:rPr>
+                <w:b w:val="false"/>
+                <w:bCs w:val="false"/>
+              </w:rPr>
+              <w:t xml:space="preserve">Open vragen over de klant, zijn bedrijf en zijn ervaringen. Laten uitpraten.</w:t>
+            </w:r>
+          </w:p>
+        </w:tc>
+        <w:tc>
+          <w:tcPr>
+            <w:tcW w:type="dxa" w:w="2300"/>
+            <w:tcBorders>
+              <w:top w:val="single" w:color="C9D1DC" w:sz="4"/>
+              <w:left w:val="single" w:color="C9D1DC" w:sz="4"/>
+              <w:bottom w:val="single" w:color="C9D1DC" w:sz="4"/>
+              <w:right w:val="single" w:color="C9D1DC" w:sz="4"/>
+            </w:tcBorders>
+            <w:tcMar>
+              <w:top w:type="dxa" w:w="80"/>
+              <w:left w:type="dxa" w:w="120"/>
+              <w:bottom w:type="dxa" w:w="80"/>
+              <w:right w:type="dxa" w:w="120"/>
+            </w:tcMar>
+          </w:tcPr>
+          <w:p>
+            <w:r>
+              <w:rPr>
+                <w:b w:val="false"/>
+                <w:bCs w:val="false"/>
+              </w:rPr>
+              <w:t xml:space="preserve">Begrijpen wat speelt</w:t>
+            </w:r>
+          </w:p>
+        </w:tc>
+      </w:tr>
+      <w:tr>
+        <w:trPr>
+          <w:cantSplit/>
+          <w:tblHeader w:val="false"/>
+        </w:trPr>
+        <w:tc>
+          <w:tcPr>
+            <w:tcW w:type="dxa" w:w="2300"/>
+            <w:tcBorders>
+              <w:top w:val="single" w:color="C9D1DC" w:sz="4"/>
+              <w:left w:val="single" w:color="C9D1DC" w:sz="4"/>
+              <w:bottom w:val="single" w:color="C9D1DC" w:sz="4"/>
+              <w:right w:val="single" w:color="C9D1DC" w:sz="4"/>
+            </w:tcBorders>
+            <w:shd w:fill="E8ECF2" w:color="auto" w:val="clear"/>
+            <w:tcMar>
+              <w:top w:type="dxa" w:w="80"/>
+              <w:left w:type="dxa" w:w="120"/>
+              <w:bottom w:type="dxa" w:w="80"/>
+              <w:right w:type="dxa" w:w="120"/>
+            </w:tcMar>
+          </w:tcPr>
+          <w:p>
+            <w:r>
+              <w:rPr>
+                <w:b/>
+                <w:bCs/>
+              </w:rPr>
+              <w:t xml:space="preserve">3. Erkennen</w:t>
+            </w:r>
+          </w:p>
+        </w:tc>
+        <w:tc>
+          <w:tcPr>
+            <w:tcW w:type="dxa" w:w="4426"/>
+            <w:tcBorders>
+              <w:top w:val="single" w:color="C9D1DC" w:sz="4"/>
+              <w:left w:val="single" w:color="C9D1DC" w:sz="4"/>
+              <w:bottom w:val="single" w:color="C9D1DC" w:sz="4"/>
+              <w:right w:val="single" w:color="C9D1DC" w:sz="4"/>
+            </w:tcBorders>
+            <w:tcMar>
+              <w:top w:type="dxa" w:w="80"/>
+              <w:left w:type="dxa" w:w="120"/>
+              <w:bottom w:type="dxa" w:w="80"/>
+              <w:right w:type="dxa" w:w="120"/>
+            </w:tcMar>
+          </w:tcPr>
+          <w:p>
+            <w:r>
+              <w:rPr>
+                <w:b w:val="false"/>
+                <w:bCs w:val="false"/>
+              </w:rPr>
+              <w:t xml:space="preserve">Benoemen wat ik hoor, zeker bij een slechte ervaring.</w:t>
+            </w:r>
+          </w:p>
+        </w:tc>
+        <w:tc>
+          <w:tcPr>
+            <w:tcW w:type="dxa" w:w="2300"/>
+            <w:tcBorders>
+              <w:top w:val="single" w:color="C9D1DC" w:sz="4"/>
+              <w:left w:val="single" w:color="C9D1DC" w:sz="4"/>
+              <w:bottom w:val="single" w:color="C9D1DC" w:sz="4"/>
+              <w:right w:val="single" w:color="C9D1DC" w:sz="4"/>
+            </w:tcBorders>
+            <w:tcMar>
+              <w:top w:type="dxa" w:w="80"/>
+              <w:left w:type="dxa" w:w="120"/>
+              <w:bottom w:type="dxa" w:w="80"/>
+              <w:right w:type="dxa" w:w="120"/>
+            </w:tcMar>
+          </w:tcPr>
+          <w:p>
+            <w:r>
+              <w:rPr>
+                <w:b w:val="false"/>
+                <w:bCs w:val="false"/>
+              </w:rPr>
+              <w:t xml:space="preserve">Vertrouwen opbouwen</w:t>
+            </w:r>
+          </w:p>
+        </w:tc>
+      </w:tr>
+      <w:tr>
+        <w:trPr>
+          <w:cantSplit/>
+          <w:tblHeader w:val="false"/>
+        </w:trPr>
+        <w:tc>
+          <w:tcPr>
+            <w:tcW w:type="dxa" w:w="2300"/>
+            <w:tcBorders>
+              <w:top w:val="single" w:color="C9D1DC" w:sz="4"/>
+              <w:left w:val="single" w:color="C9D1DC" w:sz="4"/>
+              <w:bottom w:val="single" w:color="C9D1DC" w:sz="4"/>
+              <w:right w:val="single" w:color="C9D1DC" w:sz="4"/>
+            </w:tcBorders>
+            <w:shd w:fill="E8ECF2" w:color="auto" w:val="clear"/>
+            <w:tcMar>
+              <w:top w:type="dxa" w:w="80"/>
+              <w:left w:type="dxa" w:w="120"/>
+              <w:bottom w:type="dxa" w:w="80"/>
+              <w:right w:type="dxa" w:w="120"/>
+            </w:tcMar>
+          </w:tcPr>
+          <w:p>
+            <w:r>
+              <w:rPr>
+                <w:b/>
+                <w:bCs/>
+              </w:rPr>
+              <w:t xml:space="preserve">4. Advies</w:t>
+            </w:r>
+          </w:p>
+        </w:tc>
+        <w:tc>
+          <w:tcPr>
+            <w:tcW w:type="dxa" w:w="4426"/>
+            <w:tcBorders>
+              <w:top w:val="single" w:color="C9D1DC" w:sz="4"/>
+              <w:left w:val="single" w:color="C9D1DC" w:sz="4"/>
+              <w:bottom w:val="single" w:color="C9D1DC" w:sz="4"/>
+              <w:right w:val="single" w:color="C9D1DC" w:sz="4"/>
+            </w:tcBorders>
+            <w:tcMar>
+              <w:top w:type="dxa" w:w="80"/>
+              <w:left w:type="dxa" w:w="120"/>
+              <w:bottom w:type="dxa" w:w="80"/>
+              <w:right w:type="dxa" w:w="120"/>
+            </w:tcMar>
+          </w:tcPr>
+          <w:p>
+            <w:r>
+              <w:rPr>
+                <w:b w:val="false"/>
+                <w:bCs w:val="false"/>
+              </w:rPr>
+              <w:t xml:space="preserve">Drie kernpunten, elk één keer helder gebracht. Afgestemd op wat hij vertelde.</w:t>
+            </w:r>
+          </w:p>
+        </w:tc>
+        <w:tc>
+          <w:tcPr>
+            <w:tcW w:type="dxa" w:w="2300"/>
+            <w:tcBorders>
+              <w:top w:val="single" w:color="C9D1DC" w:sz="4"/>
+              <w:left w:val="single" w:color="C9D1DC" w:sz="4"/>
+              <w:bottom w:val="single" w:color="C9D1DC" w:sz="4"/>
+              <w:right w:val="single" w:color="C9D1DC" w:sz="4"/>
+            </w:tcBorders>
+            <w:tcMar>
+              <w:top w:type="dxa" w:w="80"/>
+              <w:left w:type="dxa" w:w="120"/>
+              <w:bottom w:type="dxa" w:w="80"/>
+              <w:right w:type="dxa" w:w="120"/>
+            </w:tcMar>
+          </w:tcPr>
+          <w:p>
+            <w:r>
+              <w:rPr>
+                <w:b w:val="false"/>
+                <w:bCs w:val="false"/>
+              </w:rPr>
+              <w:t xml:space="preserve">Waarde laten zien</w:t>
+            </w:r>
+          </w:p>
+        </w:tc>
+      </w:tr>
+      <w:tr>
+        <w:trPr>
+          <w:cantSplit/>
+          <w:tblHeader w:val="false"/>
+        </w:trPr>
+        <w:tc>
+          <w:tcPr>
+            <w:tcW w:type="dxa" w:w="2300"/>
+            <w:tcBorders>
+              <w:top w:val="single" w:color="C9D1DC" w:sz="4"/>
+              <w:left w:val="single" w:color="C9D1DC" w:sz="4"/>
+              <w:bottom w:val="single" w:color="C9D1DC" w:sz="4"/>
+              <w:right w:val="single" w:color="C9D1DC" w:sz="4"/>
+            </w:tcBorders>
+            <w:shd w:fill="E8ECF2" w:color="auto" w:val="clear"/>
+            <w:tcMar>
+              <w:top w:type="dxa" w:w="80"/>
+              <w:left w:type="dxa" w:w="120"/>
+              <w:bottom w:type="dxa" w:w="80"/>
+              <w:right w:type="dxa" w:w="120"/>
+            </w:tcMar>
+          </w:tcPr>
+          <w:p>
+            <w:r>
+              <w:rPr>
+                <w:b/>
+                <w:bCs/>
+              </w:rPr>
+              <w:t xml:space="preserve">5. Afsluiting</w:t>
+            </w:r>
+          </w:p>
+        </w:tc>
+        <w:tc>
+          <w:tcPr>
+            <w:tcW w:type="dxa" w:w="4426"/>
+            <w:tcBorders>
+              <w:top w:val="single" w:color="C9D1DC" w:sz="4"/>
+              <w:left w:val="single" w:color="C9D1DC" w:sz="4"/>
+              <w:bottom w:val="single" w:color="C9D1DC" w:sz="4"/>
+              <w:right w:val="single" w:color="C9D1DC" w:sz="4"/>
+            </w:tcBorders>
+            <w:tcMar>
+              <w:top w:type="dxa" w:w="80"/>
+              <w:left w:type="dxa" w:w="120"/>
+              <w:bottom w:type="dxa" w:w="80"/>
+              <w:right w:type="dxa" w:w="120"/>
+            </w:tcMar>
+          </w:tcPr>
+          <w:p>
+            <w:r>
+              <w:rPr>
+                <w:b w:val="false"/>
+                <w:bCs w:val="false"/>
+              </w:rPr>
+              <w:t xml:space="preserve">Samenvatten, checken of alles klopt, duidelijke vervolgstap afspreken.</w:t>
+            </w:r>
+          </w:p>
+        </w:tc>
+        <w:tc>
+          <w:tcPr>
+            <w:tcW w:type="dxa" w:w="2300"/>
+            <w:tcBorders>
+              <w:top w:val="single" w:color="C9D1DC" w:sz="4"/>
+              <w:left w:val="single" w:color="C9D1DC" w:sz="4"/>
+              <w:bottom w:val="single" w:color="C9D1DC" w:sz="4"/>
+              <w:right w:val="single" w:color="C9D1DC" w:sz="4"/>
+            </w:tcBorders>
+            <w:tcMar>
+              <w:top w:type="dxa" w:w="80"/>
+              <w:left w:type="dxa" w:w="120"/>
+              <w:bottom w:type="dxa" w:w="80"/>
+              <w:right w:type="dxa" w:w="120"/>
+            </w:tcMar>
+          </w:tcPr>
+          <w:p>
+            <w:r>
+              <w:rPr>
+                <w:b w:val="false"/>
+                <w:bCs w:val="false"/>
+              </w:rPr>
+              <w:t xml:space="preserve">Duidelijkheid geven</w:t>
+            </w:r>
+          </w:p>
+        </w:tc>
+      </w:tr>
+    </w:tbl>
+    <w:p>
+      <w:pPr>
+        <w:spacing w:after="120"/>
+      </w:pPr>
+    </w:p>
+    <w:p>
+      <w:pPr>
+        <w:pStyle w:val="Heading2"/>
+      </w:pPr>
+      <w:r>
+        <w:t xml:space="preserve">Actieplan</w:t>
+      </w:r>
+    </w:p>
+    <w:tbl>
+      <w:tblPr>
+        <w:tblW w:type="dxa" w:w="9026"/>
+        <w:tblBorders>
+          <w:top w:val="single" w:color="auto" w:sz="4"/>
+          <w:left w:val="single" w:color="auto" w:sz="4"/>
+          <w:bottom w:val="single" w:color="auto" w:sz="4"/>
+          <w:right w:val="single" w:color="auto" w:sz="4"/>
+          <w:insideH w:val="single" w:color="auto" w:sz="4"/>
+          <w:insideV w:val="single" w:color="auto" w:sz="4"/>
+        </w:tblBorders>
+      </w:tblPr>
+      <w:tblGrid>
+        <w:gridCol w:w="4826"/>
+        <w:gridCol w:w="2100"/>
+        <w:gridCol w:w="2100"/>
+      </w:tblGrid>
+      <w:tr>
+        <w:trPr>
+          <w:cantSplit/>
+          <w:tblHeader/>
+        </w:trPr>
+        <w:tc>
+          <w:tcPr>
+            <w:tcW w:type="dxa" w:w="4826"/>
+            <w:tcBorders>
+              <w:top w:val="single" w:color="C9D1DC" w:sz="4"/>
+              <w:left w:val="single" w:color="C9D1DC" w:sz="4"/>
+              <w:bottom w:val="single" w:color="C9D1DC" w:sz="4"/>
+              <w:right w:val="single" w:color="C9D1DC" w:sz="4"/>
+            </w:tcBorders>
+            <w:shd w:fill="1F2A44" w:color="auto" w:val="clear"/>
+            <w:tcMar>
+              <w:top w:type="dxa" w:w="80"/>
+              <w:left w:type="dxa" w:w="120"/>
+              <w:bottom w:type="dxa" w:w="80"/>
+              <w:right w:type="dxa" w:w="120"/>
+            </w:tcMar>
+          </w:tcPr>
+          <w:p>
+            <w:r>
+              <w:rPr>
+                <w:b/>
+                <w:bCs/>
+                <w:color w:val="FFFFFF"/>
+              </w:rPr>
+              <w:t xml:space="preserve">Actie</w:t>
+            </w:r>
+          </w:p>
+        </w:tc>
+        <w:tc>
+          <w:tcPr>
+            <w:tcW w:type="dxa" w:w="2100"/>
+            <w:tcBorders>
+              <w:top w:val="single" w:color="C9D1DC" w:sz="4"/>
+              <w:left w:val="single" w:color="C9D1DC" w:sz="4"/>
+              <w:bottom w:val="single" w:color="C9D1DC" w:sz="4"/>
+              <w:right w:val="single" w:color="C9D1DC" w:sz="4"/>
+            </w:tcBorders>
+            <w:shd w:fill="1F2A44" w:color="auto" w:val="clear"/>
+            <w:tcMar>
+              <w:top w:type="dxa" w:w="80"/>
+              <w:left w:type="dxa" w:w="120"/>
+              <w:bottom w:type="dxa" w:w="80"/>
+              <w:right w:type="dxa" w:w="120"/>
+            </w:tcMar>
+          </w:tcPr>
+          <w:p>
+            <w:r>
+              <w:rPr>
+                <w:b/>
+                <w:bCs/>
+                <w:color w:val="FFFFFF"/>
+              </w:rPr>
+              <w:t xml:space="preserve">Wanneer</w:t>
+            </w:r>
+          </w:p>
+        </w:tc>
+        <w:tc>
+          <w:tcPr>
+            <w:tcW w:type="dxa" w:w="2100"/>
+            <w:tcBorders>
+              <w:top w:val="single" w:color="C9D1DC" w:sz="4"/>
+              <w:left w:val="single" w:color="C9D1DC" w:sz="4"/>
+              <w:bottom w:val="single" w:color="C9D1DC" w:sz="4"/>
+              <w:right w:val="single" w:color="C9D1DC" w:sz="4"/>
+            </w:tcBorders>
+            <w:shd w:fill="1F2A44" w:color="auto" w:val="clear"/>
+            <w:tcMar>
+              <w:top w:type="dxa" w:w="80"/>
+              <w:left w:type="dxa" w:w="120"/>
+              <w:bottom w:type="dxa" w:w="80"/>
+              <w:right w:type="dxa" w:w="120"/>
+            </w:tcMar>
+          </w:tcPr>
+          <w:p>
+            <w:r>
+              <w:rPr>
+                <w:b/>
+                <w:bCs/>
+                <w:color w:val="FFFFFF"/>
+              </w:rPr>
+              <w:t xml:space="preserve">Hoe ik het meet</w:t>
+            </w:r>
+          </w:p>
+        </w:tc>
+      </w:tr>
+      <w:tr>
+        <w:trPr>
+          <w:cantSplit/>
+          <w:tblHeader w:val="false"/>
+        </w:trPr>
+        <w:tc>
+          <w:tcPr>
+            <w:tcW w:type="dxa" w:w="4826"/>
+            <w:tcBorders>
+              <w:top w:val="single" w:color="C9D1DC" w:sz="4"/>
+              <w:left w:val="single" w:color="C9D1DC" w:sz="4"/>
+              <w:bottom w:val="single" w:color="C9D1DC" w:sz="4"/>
+              <w:right w:val="single" w:color="C9D1DC" w:sz="4"/>
+            </w:tcBorders>
+            <w:shd w:fill="E8ECF2" w:color="auto" w:val="clear"/>
+            <w:tcMar>
+              <w:top w:type="dxa" w:w="80"/>
+              <w:left w:type="dxa" w:w="120"/>
+              <w:bottom w:type="dxa" w:w="80"/>
+              <w:right w:type="dxa" w:w="120"/>
+            </w:tcMar>
+          </w:tcPr>
+          <w:p>
+            <w:r>
+              <w:rPr>
+                <w:b/>
+                <w:bCs/>
+              </w:rPr>
+              <w:t xml:space="preserve">Gesprek voorbereiden: 3 kernpunten op papier.</w:t>
+            </w:r>
+          </w:p>
+        </w:tc>
+        <w:tc>
+          <w:tcPr>
+            <w:tcW w:type="dxa" w:w="2100"/>
+            <w:tcBorders>
+              <w:top w:val="single" w:color="C9D1DC" w:sz="4"/>
+              <w:left w:val="single" w:color="C9D1DC" w:sz="4"/>
+              <w:bottom w:val="single" w:color="C9D1DC" w:sz="4"/>
+              <w:right w:val="single" w:color="C9D1DC" w:sz="4"/>
+            </w:tcBorders>
+            <w:tcMar>
+              <w:top w:type="dxa" w:w="80"/>
+              <w:left w:type="dxa" w:w="120"/>
+              <w:bottom w:type="dxa" w:w="80"/>
+              <w:right w:type="dxa" w:w="120"/>
+            </w:tcMar>
+          </w:tcPr>
+          <w:p>
+            <w:r>
+              <w:rPr>
+                <w:b w:val="false"/>
+                <w:bCs w:val="false"/>
+              </w:rPr>
+              <w:t xml:space="preserve">Voor elk gesprek</w:t>
+            </w:r>
+          </w:p>
+        </w:tc>
+        <w:tc>
+          <w:tcPr>
+            <w:tcW w:type="dxa" w:w="2100"/>
+            <w:tcBorders>
+              <w:top w:val="single" w:color="C9D1DC" w:sz="4"/>
+              <w:left w:val="single" w:color="C9D1DC" w:sz="4"/>
+              <w:bottom w:val="single" w:color="C9D1DC" w:sz="4"/>
+              <w:right w:val="single" w:color="C9D1DC" w:sz="4"/>
+            </w:tcBorders>
+            <w:tcMar>
+              <w:top w:type="dxa" w:w="80"/>
+              <w:left w:type="dxa" w:w="120"/>
+              <w:bottom w:type="dxa" w:w="80"/>
+              <w:right w:type="dxa" w:w="120"/>
+            </w:tcMar>
+          </w:tcPr>
+          <w:p>
+            <w:r>
+              <w:rPr>
+                <w:b w:val="false"/>
+                <w:bCs w:val="false"/>
+              </w:rPr>
+              <w:t xml:space="preserve">Ik herhaal mezelf niet.</w:t>
+            </w:r>
+          </w:p>
+        </w:tc>
+      </w:tr>
+      <w:tr>
+        <w:trPr>
+          <w:cantSplit/>
+          <w:tblHeader w:val="false"/>
+        </w:trPr>
+        <w:tc>
+          <w:tcPr>
+            <w:tcW w:type="dxa" w:w="4826"/>
+            <w:tcBorders>
+              <w:top w:val="single" w:color="C9D1DC" w:sz="4"/>
+              <w:left w:val="single" w:color="C9D1DC" w:sz="4"/>
+              <w:bottom w:val="single" w:color="C9D1DC" w:sz="4"/>
+              <w:right w:val="single" w:color="C9D1DC" w:sz="4"/>
+            </w:tcBorders>
+            <w:shd w:fill="E8ECF2" w:color="auto" w:val="clear"/>
+            <w:tcMar>
+              <w:top w:type="dxa" w:w="80"/>
+              <w:left w:type="dxa" w:w="120"/>
+              <w:bottom w:type="dxa" w:w="80"/>
+              <w:right w:type="dxa" w:w="120"/>
+            </w:tcMar>
+          </w:tcPr>
+          <w:p>
+            <w:r>
+              <w:rPr>
+                <w:b/>
+                <w:bCs/>
+              </w:rPr>
+              <w:t xml:space="preserve">Openen met een praatje, niet met de laptop.</w:t>
+            </w:r>
+          </w:p>
+        </w:tc>
+        <w:tc>
+          <w:tcPr>
+            <w:tcW w:type="dxa" w:w="2100"/>
+            <w:tcBorders>
+              <w:top w:val="single" w:color="C9D1DC" w:sz="4"/>
+              <w:left w:val="single" w:color="C9D1DC" w:sz="4"/>
+              <w:bottom w:val="single" w:color="C9D1DC" w:sz="4"/>
+              <w:right w:val="single" w:color="C9D1DC" w:sz="4"/>
+            </w:tcBorders>
+            <w:tcMar>
+              <w:top w:type="dxa" w:w="80"/>
+              <w:left w:type="dxa" w:w="120"/>
+              <w:bottom w:type="dxa" w:w="80"/>
+              <w:right w:type="dxa" w:w="120"/>
+            </w:tcMar>
+          </w:tcPr>
+          <w:p>
+            <w:r>
+              <w:rPr>
+                <w:b w:val="false"/>
+                <w:bCs w:val="false"/>
+              </w:rPr>
+              <w:t xml:space="preserve">Elk gesprek</w:t>
+            </w:r>
+          </w:p>
+        </w:tc>
+        <w:tc>
+          <w:tcPr>
+            <w:tcW w:type="dxa" w:w="2100"/>
+            <w:tcBorders>
+              <w:top w:val="single" w:color="C9D1DC" w:sz="4"/>
+              <w:left w:val="single" w:color="C9D1DC" w:sz="4"/>
+              <w:bottom w:val="single" w:color="C9D1DC" w:sz="4"/>
+              <w:right w:val="single" w:color="C9D1DC" w:sz="4"/>
+            </w:tcBorders>
+            <w:tcMar>
+              <w:top w:type="dxa" w:w="80"/>
+              <w:left w:type="dxa" w:w="120"/>
+              <w:bottom w:type="dxa" w:w="80"/>
+              <w:right w:type="dxa" w:w="120"/>
+            </w:tcMar>
+          </w:tcPr>
+          <w:p>
+            <w:r>
+              <w:rPr>
+                <w:b w:val="false"/>
+                <w:bCs w:val="false"/>
+              </w:rPr>
+              <w:t xml:space="preserve">Eerste minuten zonder scherm.</w:t>
+            </w:r>
+          </w:p>
+        </w:tc>
+      </w:tr>
+      <w:tr>
+        <w:trPr>
+          <w:cantSplit/>
+          <w:tblHeader w:val="false"/>
+        </w:trPr>
+        <w:tc>
+          <w:tcPr>
+            <w:tcW w:type="dxa" w:w="4826"/>
+            <w:tcBorders>
+              <w:top w:val="single" w:color="C9D1DC" w:sz="4"/>
+              <w:left w:val="single" w:color="C9D1DC" w:sz="4"/>
+              <w:bottom w:val="single" w:color="C9D1DC" w:sz="4"/>
+              <w:right w:val="single" w:color="C9D1DC" w:sz="4"/>
+            </w:tcBorders>
+            <w:shd w:fill="E8ECF2" w:color="auto" w:val="clear"/>
+            <w:tcMar>
+              <w:top w:type="dxa" w:w="80"/>
+              <w:left w:type="dxa" w:w="120"/>
+              <w:bottom w:type="dxa" w:w="80"/>
+              <w:right w:type="dxa" w:w="120"/>
+            </w:tcMar>
+          </w:tcPr>
+          <w:p>
+            <w:r>
+              <w:rPr>
+                <w:b/>
+                <w:bCs/>
+              </w:rPr>
+              <w:t xml:space="preserve">Minstens 3 open vragen stellen over de klant.</w:t>
+            </w:r>
+          </w:p>
+        </w:tc>
+        <w:tc>
+          <w:tcPr>
+            <w:tcW w:type="dxa" w:w="2100"/>
+            <w:tcBorders>
+              <w:top w:val="single" w:color="C9D1DC" w:sz="4"/>
+              <w:left w:val="single" w:color="C9D1DC" w:sz="4"/>
+              <w:bottom w:val="single" w:color="C9D1DC" w:sz="4"/>
+              <w:right w:val="single" w:color="C9D1DC" w:sz="4"/>
+            </w:tcBorders>
+            <w:tcMar>
+              <w:top w:type="dxa" w:w="80"/>
+              <w:left w:type="dxa" w:w="120"/>
+              <w:bottom w:type="dxa" w:w="80"/>
+              <w:right w:type="dxa" w:w="120"/>
+            </w:tcMar>
+          </w:tcPr>
+          <w:p>
+            <w:r>
+              <w:rPr>
+                <w:b w:val="false"/>
+                <w:bCs w:val="false"/>
+              </w:rPr>
+              <w:t xml:space="preserve">Elk gesprek</w:t>
+            </w:r>
+          </w:p>
+        </w:tc>
+        <w:tc>
+          <w:tcPr>
+            <w:tcW w:type="dxa" w:w="2100"/>
+            <w:tcBorders>
+              <w:top w:val="single" w:color="C9D1DC" w:sz="4"/>
+              <w:left w:val="single" w:color="C9D1DC" w:sz="4"/>
+              <w:bottom w:val="single" w:color="C9D1DC" w:sz="4"/>
+              <w:right w:val="single" w:color="C9D1DC" w:sz="4"/>
+            </w:tcBorders>
+            <w:tcMar>
+              <w:top w:type="dxa" w:w="80"/>
+              <w:left w:type="dxa" w:w="120"/>
+              <w:bottom w:type="dxa" w:w="80"/>
+              <w:right w:type="dxa" w:w="120"/>
+            </w:tcMar>
+          </w:tcPr>
+          <w:p>
+            <w:r>
+              <w:rPr>
+                <w:b w:val="false"/>
+                <w:bCs w:val="false"/>
+              </w:rPr>
+              <w:t xml:space="preserve">Vragen afgevinkt na het gesprek.</w:t>
+            </w:r>
+          </w:p>
+        </w:tc>
+      </w:tr>
+      <w:tr>
+        <w:trPr>
+          <w:cantSplit/>
+          <w:tblHeader w:val="false"/>
+        </w:trPr>
+        <w:tc>
+          <w:tcPr>
+            <w:tcW w:type="dxa" w:w="4826"/>
+            <w:tcBorders>
+              <w:top w:val="single" w:color="C9D1DC" w:sz="4"/>
+              <w:left w:val="single" w:color="C9D1DC" w:sz="4"/>
+              <w:bottom w:val="single" w:color="C9D1DC" w:sz="4"/>
+              <w:right w:val="single" w:color="C9D1DC" w:sz="4"/>
+            </w:tcBorders>
+            <w:shd w:fill="E8ECF2" w:color="auto" w:val="clear"/>
+            <w:tcMar>
+              <w:top w:type="dxa" w:w="80"/>
+              <w:left w:type="dxa" w:w="120"/>
+              <w:bottom w:type="dxa" w:w="80"/>
+              <w:right w:type="dxa" w:w="120"/>
+            </w:tcMar>
+          </w:tcPr>
+          <w:p>
+            <w:r>
+              <w:rPr>
+                <w:b/>
+                <w:bCs/>
+              </w:rPr>
+              <w:t xml:space="preserve">Bij een slechte ervaring eerst erkennen, dan oplossen.</w:t>
+            </w:r>
+          </w:p>
+        </w:tc>
+        <w:tc>
+          <w:tcPr>
+            <w:tcW w:type="dxa" w:w="2100"/>
+            <w:tcBorders>
+              <w:top w:val="single" w:color="C9D1DC" w:sz="4"/>
+              <w:left w:val="single" w:color="C9D1DC" w:sz="4"/>
+              <w:bottom w:val="single" w:color="C9D1DC" w:sz="4"/>
+              <w:right w:val="single" w:color="C9D1DC" w:sz="4"/>
+            </w:tcBorders>
+            <w:tcMar>
+              <w:top w:type="dxa" w:w="80"/>
+              <w:left w:type="dxa" w:w="120"/>
+              <w:bottom w:type="dxa" w:w="80"/>
+              <w:right w:type="dxa" w:w="120"/>
+            </w:tcMar>
+          </w:tcPr>
+          <w:p>
+            <w:r>
+              <w:rPr>
+                <w:b w:val="false"/>
+                <w:bCs w:val="false"/>
+              </w:rPr>
+              <w:t xml:space="preserve">Wanneer het speelt</w:t>
+            </w:r>
+          </w:p>
+        </w:tc>
+        <w:tc>
+          <w:tcPr>
+            <w:tcW w:type="dxa" w:w="2100"/>
+            <w:tcBorders>
+              <w:top w:val="single" w:color="C9D1DC" w:sz="4"/>
+              <w:left w:val="single" w:color="C9D1DC" w:sz="4"/>
+              <w:bottom w:val="single" w:color="C9D1DC" w:sz="4"/>
+              <w:right w:val="single" w:color="C9D1DC" w:sz="4"/>
+            </w:tcBorders>
+            <w:tcMar>
+              <w:top w:type="dxa" w:w="80"/>
+              <w:left w:type="dxa" w:w="120"/>
+              <w:bottom w:type="dxa" w:w="80"/>
+              <w:right w:type="dxa" w:w="120"/>
+            </w:tcMar>
+          </w:tcPr>
+          <w:p>
+            <w:r>
+              <w:rPr>
+                <w:b w:val="false"/>
+                <w:bCs w:val="false"/>
+              </w:rPr>
+              <w:t xml:space="preserve">Klant voelt zich gehoord.</w:t>
+            </w:r>
+          </w:p>
+        </w:tc>
+      </w:tr>
+      <w:tr>
+        <w:trPr>
+          <w:cantSplit/>
+          <w:tblHeader w:val="false"/>
+        </w:trPr>
+        <w:tc>
+          <w:tcPr>
+            <w:tcW w:type="dxa" w:w="4826"/>
+            <w:tcBorders>
+              <w:top w:val="single" w:color="C9D1DC" w:sz="4"/>
+              <w:left w:val="single" w:color="C9D1DC" w:sz="4"/>
+              <w:bottom w:val="single" w:color="C9D1DC" w:sz="4"/>
+              <w:right w:val="single" w:color="C9D1DC" w:sz="4"/>
+            </w:tcBorders>
+            <w:shd w:fill="E8ECF2" w:color="auto" w:val="clear"/>
+            <w:tcMar>
+              <w:top w:type="dxa" w:w="80"/>
+              <w:left w:type="dxa" w:w="120"/>
+              <w:bottom w:type="dxa" w:w="80"/>
+              <w:right w:type="dxa" w:w="120"/>
+            </w:tcMar>
+          </w:tcPr>
+          <w:p>
+            <w:r>
+              <w:rPr>
+                <w:b/>
+                <w:bCs/>
+              </w:rPr>
+              <w:t xml:space="preserve">Laptop alleen open als het echt nodig is.</w:t>
+            </w:r>
+          </w:p>
+        </w:tc>
+        <w:tc>
+          <w:tcPr>
+            <w:tcW w:type="dxa" w:w="2100"/>
+            <w:tcBorders>
+              <w:top w:val="single" w:color="C9D1DC" w:sz="4"/>
+              <w:left w:val="single" w:color="C9D1DC" w:sz="4"/>
+              <w:bottom w:val="single" w:color="C9D1DC" w:sz="4"/>
+              <w:right w:val="single" w:color="C9D1DC" w:sz="4"/>
+            </w:tcBorders>
+            <w:tcMar>
+              <w:top w:type="dxa" w:w="80"/>
+              <w:left w:type="dxa" w:w="120"/>
+              <w:bottom w:type="dxa" w:w="80"/>
+              <w:right w:type="dxa" w:w="120"/>
+            </w:tcMar>
+          </w:tcPr>
+          <w:p>
+            <w:r>
+              <w:rPr>
+                <w:b w:val="false"/>
+                <w:bCs w:val="false"/>
+              </w:rPr>
+              <w:t xml:space="preserve">Elk gesprek</w:t>
+            </w:r>
+          </w:p>
+        </w:tc>
+        <w:tc>
+          <w:tcPr>
+            <w:tcW w:type="dxa" w:w="2100"/>
+            <w:tcBorders>
+              <w:top w:val="single" w:color="C9D1DC" w:sz="4"/>
+              <w:left w:val="single" w:color="C9D1DC" w:sz="4"/>
+              <w:bottom w:val="single" w:color="C9D1DC" w:sz="4"/>
+              <w:right w:val="single" w:color="C9D1DC" w:sz="4"/>
+            </w:tcBorders>
+            <w:tcMar>
+              <w:top w:type="dxa" w:w="80"/>
+              <w:left w:type="dxa" w:w="120"/>
+              <w:bottom w:type="dxa" w:w="80"/>
+              <w:right w:type="dxa" w:w="120"/>
+            </w:tcMar>
+          </w:tcPr>
+          <w:p>
+            <w:r>
+              <w:rPr>
+                <w:b w:val="false"/>
+                <w:bCs w:val="false"/>
+              </w:rPr>
+              <w:t xml:space="preserve">Geen stiltes door het scherm.</w:t>
+            </w:r>
+          </w:p>
+        </w:tc>
+      </w:tr>
+      <w:tr>
+        <w:trPr>
+          <w:cantSplit/>
+          <w:tblHeader w:val="false"/>
+        </w:trPr>
+        <w:tc>
+          <w:tcPr>
+            <w:tcW w:type="dxa" w:w="4826"/>
+            <w:tcBorders>
+              <w:top w:val="single" w:color="C9D1DC" w:sz="4"/>
+              <w:left w:val="single" w:color="C9D1DC" w:sz="4"/>
+              <w:bottom w:val="single" w:color="C9D1DC" w:sz="4"/>
+              <w:right w:val="single" w:color="C9D1DC" w:sz="4"/>
+            </w:tcBorders>
+            <w:shd w:fill="E8ECF2" w:color="auto" w:val="clear"/>
+            <w:tcMar>
+              <w:top w:type="dxa" w:w="80"/>
+              <w:left w:type="dxa" w:w="120"/>
+              <w:bottom w:type="dxa" w:w="80"/>
+              <w:right w:type="dxa" w:w="120"/>
+            </w:tcMar>
+          </w:tcPr>
+          <w:p>
+            <w:r>
+              <w:rPr>
+                <w:b/>
+                <w:bCs/>
+              </w:rPr>
+              <w:t xml:space="preserve">Houding: rechtop, oogcontact, naar de klant toe.</w:t>
+            </w:r>
+          </w:p>
+        </w:tc>
+        <w:tc>
+          <w:tcPr>
+            <w:tcW w:type="dxa" w:w="2100"/>
+            <w:tcBorders>
+              <w:top w:val="single" w:color="C9D1DC" w:sz="4"/>
+              <w:left w:val="single" w:color="C9D1DC" w:sz="4"/>
+              <w:bottom w:val="single" w:color="C9D1DC" w:sz="4"/>
+              <w:right w:val="single" w:color="C9D1DC" w:sz="4"/>
+            </w:tcBorders>
+            <w:tcMar>
+              <w:top w:type="dxa" w:w="80"/>
+              <w:left w:type="dxa" w:w="120"/>
+              <w:bottom w:type="dxa" w:w="80"/>
+              <w:right w:type="dxa" w:w="120"/>
+            </w:tcMar>
+          </w:tcPr>
+          <w:p>
+            <w:r>
+              <w:rPr>
+                <w:b w:val="false"/>
+                <w:bCs w:val="false"/>
+              </w:rPr>
+              <w:t xml:space="preserve">Elk gesprek</w:t>
+            </w:r>
+          </w:p>
+        </w:tc>
+        <w:tc>
+          <w:tcPr>
+            <w:tcW w:type="dxa" w:w="2100"/>
+            <w:tcBorders>
+              <w:top w:val="single" w:color="C9D1DC" w:sz="4"/>
+              <w:left w:val="single" w:color="C9D1DC" w:sz="4"/>
+              <w:bottom w:val="single" w:color="C9D1DC" w:sz="4"/>
+              <w:right w:val="single" w:color="C9D1DC" w:sz="4"/>
+            </w:tcBorders>
+            <w:tcMar>
+              <w:top w:type="dxa" w:w="80"/>
+              <w:left w:type="dxa" w:w="120"/>
+              <w:bottom w:type="dxa" w:w="80"/>
+              <w:right w:type="dxa" w:w="120"/>
+            </w:tcMar>
+          </w:tcPr>
+          <w:p>
+            <w:r>
+              <w:rPr>
+                <w:b w:val="false"/>
+                <w:bCs w:val="false"/>
+              </w:rPr>
+              <w:t xml:space="preserve">Zelfcheck na afloop.</w:t>
+            </w:r>
+          </w:p>
+        </w:tc>
+      </w:tr>
+      <w:tr>
+        <w:trPr>
+          <w:cantSplit/>
+          <w:tblHeader w:val="false"/>
+        </w:trPr>
+        <w:tc>
+          <w:tcPr>
+            <w:tcW w:type="dxa" w:w="4826"/>
+            <w:tcBorders>
+              <w:top w:val="single" w:color="C9D1DC" w:sz="4"/>
+              <w:left w:val="single" w:color="C9D1DC" w:sz="4"/>
+              <w:bottom w:val="single" w:color="C9D1DC" w:sz="4"/>
+              <w:right w:val="single" w:color="C9D1DC" w:sz="4"/>
+            </w:tcBorders>
+            <w:shd w:fill="E8ECF2" w:color="auto" w:val="clear"/>
+            <w:tcMar>
+              <w:top w:type="dxa" w:w="80"/>
+              <w:left w:type="dxa" w:w="120"/>
+              <w:bottom w:type="dxa" w:w="80"/>
+              <w:right w:type="dxa" w:w="120"/>
+            </w:tcMar>
+          </w:tcPr>
+          <w:p>
+            <w:r>
+              <w:rPr>
+                <w:b/>
+                <w:bCs/>
+              </w:rPr>
+              <w:t xml:space="preserve">Na elk gesprek 5 minuten terugkijken op deze punten.</w:t>
+            </w:r>
+          </w:p>
+        </w:tc>
+        <w:tc>
+          <w:tcPr>
+            <w:tcW w:type="dxa" w:w="2100"/>
+            <w:tcBorders>
+              <w:top w:val="single" w:color="C9D1DC" w:sz="4"/>
+              <w:left w:val="single" w:color="C9D1DC" w:sz="4"/>
+              <w:bottom w:val="single" w:color="C9D1DC" w:sz="4"/>
+              <w:right w:val="single" w:color="C9D1DC" w:sz="4"/>
+            </w:tcBorders>
+            <w:tcMar>
+              <w:top w:type="dxa" w:w="80"/>
+              <w:left w:type="dxa" w:w="120"/>
+              <w:bottom w:type="dxa" w:w="80"/>
+              <w:right w:type="dxa" w:w="120"/>
+            </w:tcMar>
+          </w:tcPr>
+          <w:p>
+            <w:r>
+              <w:rPr>
+                <w:b w:val="false"/>
+                <w:bCs w:val="false"/>
+              </w:rPr>
+              <w:t xml:space="preserve">Na elk gesprek</w:t>
+            </w:r>
+          </w:p>
+        </w:tc>
+        <w:tc>
+          <w:tcPr>
+            <w:tcW w:type="dxa" w:w="2100"/>
+            <w:tcBorders>
+              <w:top w:val="single" w:color="C9D1DC" w:sz="4"/>
+              <w:left w:val="single" w:color="C9D1DC" w:sz="4"/>
+              <w:bottom w:val="single" w:color="C9D1DC" w:sz="4"/>
+              <w:right w:val="single" w:color="C9D1DC" w:sz="4"/>
+            </w:tcBorders>
+            <w:tcMar>
+              <w:top w:type="dxa" w:w="80"/>
+              <w:left w:type="dxa" w:w="120"/>
+              <w:bottom w:type="dxa" w:w="80"/>
+              <w:right w:type="dxa" w:w="120"/>
+            </w:tcMar>
+          </w:tcPr>
+          <w:p>
+            <w:r>
+              <w:rPr>
+                <w:b w:val="false"/>
+                <w:bCs w:val="false"/>
+              </w:rPr>
+              <w:t xml:space="preserve">Korte notitie per gesprek.</w:t>
+            </w:r>
+          </w:p>
+        </w:tc>
+      </w:tr>
+    </w:tbl>
+    <w:p>
+      <w:pPr>
+        <w:spacing w:after="120"/>
+      </w:pPr>
+    </w:p>
+    <w:p>
+      <w:pPr>
+        <w:pStyle w:val="Heading2"/>
+      </w:pPr>
+      <w:r>
+        <w:t xml:space="preserve">Vervolg met Anouar</w:t>
+      </w:r>
+    </w:p>
+    <w:p>
+      <w:pPr>
+        <w:spacing w:after="140" w:line="288"/>
+      </w:pPr>
+      <w:r>
+        <w:t xml:space="preserve">Dit gesprek is geweest. De relatie met Anouar hoeft daarmee niet voorbij te zijn.</w:t>
+      </w:r>
+    </w:p>
+    <w:p>
+      <w:pPr>
+        <w:spacing w:after="140" w:line="288"/>
+      </w:pPr>
+      <w:r>
+        <w:t xml:space="preserve">Ik wil hem opnieuw benaderen. Niet met een verkooppraatje, maar met aandacht voor wat hij vertelde.</w:t>
       </w:r>
     </w:p>
     <w:p>
@@ -708,12 +2496,12 @@
         <w:pStyle w:val="ListParagraph"/>
         <w:numPr>
           <w:ilvl w:val="0"/>
-          <w:numId w:val="2"/>
+          <w:numId w:val="3"/>
         </w:numPr>
-        <w:spacing w:after="80"/>
-      </w:pPr>
-      <w:r>
-        <w:t xml:space="preserve">Gesprek voorbereiden: 3 kernpunten op papier, zodat ik niets herhaal.</w:t>
+        <w:spacing w:after="80" w:line="276"/>
+      </w:pPr>
+      <w:r>
+        <w:t xml:space="preserve">Contact opnemen en hem bedanken voor zijn openheid.</w:t>
       </w:r>
     </w:p>
     <w:p>
@@ -721,12 +2509,12 @@
         <w:pStyle w:val="ListParagraph"/>
         <w:numPr>
           <w:ilvl w:val="0"/>
-          <w:numId w:val="2"/>
+          <w:numId w:val="3"/>
         </w:numPr>
-        <w:spacing w:after="80"/>
-      </w:pPr>
-      <w:r>
-        <w:t xml:space="preserve">Openen met een praatje, niet met de laptop.</w:t>
+        <w:spacing w:after="80" w:line="276"/>
+      </w:pPr>
+      <w:r>
+        <w:t xml:space="preserve">Laten merken dat ik zijn ervaring met Swiftnine en het slechte advies serieus neem.</w:t>
       </w:r>
     </w:p>
     <w:p>
@@ -734,12 +2522,12 @@
         <w:pStyle w:val="ListParagraph"/>
         <w:numPr>
           <w:ilvl w:val="0"/>
-          <w:numId w:val="2"/>
+          <w:numId w:val="3"/>
         </w:numPr>
-        <w:spacing w:after="80"/>
-      </w:pPr>
-      <w:r>
-        <w:t xml:space="preserve">Laptop dicht tenzij ik iets moet laten zien of opzoeken.</w:t>
+        <w:spacing w:after="80" w:line="276"/>
+      </w:pPr>
+      <w:r>
+        <w:t xml:space="preserve">Een nieuw gesprek voorstellen waarin hij centraal staat.</w:t>
       </w:r>
     </w:p>
     <w:p>
@@ -747,69 +2535,50 @@
         <w:pStyle w:val="ListParagraph"/>
         <w:numPr>
           <w:ilvl w:val="0"/>
-          <w:numId w:val="2"/>
+          <w:numId w:val="3"/>
         </w:numPr>
-        <w:spacing w:after="80"/>
-      </w:pPr>
-      <w:r>
-        <w:t xml:space="preserve">Minstens 3 open vragen stellen over de klant en zijn bedrijf.</w:t>
-      </w:r>
-    </w:p>
-    <w:p>
-      <w:pPr>
-        <w:pStyle w:val="ListParagraph"/>
-        <w:numPr>
-          <w:ilvl w:val="0"/>
-          <w:numId w:val="2"/>
-        </w:numPr>
-        <w:spacing w:after="80"/>
-      </w:pPr>
-      <w:r>
-        <w:t xml:space="preserve">Bij een slechte ervaring eerst erkennen, dan pas oplossen.</w:t>
-      </w:r>
-    </w:p>
-    <w:p>
-      <w:pPr>
-        <w:pStyle w:val="ListParagraph"/>
-        <w:numPr>
-          <w:ilvl w:val="0"/>
-          <w:numId w:val="2"/>
-        </w:numPr>
-        <w:spacing w:after="80"/>
-      </w:pPr>
-      <w:r>
-        <w:t xml:space="preserve">Laten uitpraten. Stiltes van de klant niet opvullen.</w:t>
-      </w:r>
-    </w:p>
-    <w:p>
-      <w:pPr>
-        <w:pStyle w:val="ListParagraph"/>
-        <w:numPr>
-          <w:ilvl w:val="0"/>
-          <w:numId w:val="2"/>
-        </w:numPr>
-        <w:spacing w:after="80"/>
-      </w:pPr>
-      <w:r>
-        <w:t xml:space="preserve">Houding: rechtop, oogcontact, naar de klant toe.</w:t>
-      </w:r>
-    </w:p>
-    <w:p>
-      <w:pPr>
-        <w:pStyle w:val="ListParagraph"/>
-        <w:numPr>
-          <w:ilvl w:val="0"/>
-          <w:numId w:val="2"/>
-        </w:numPr>
-        <w:spacing w:after="80"/>
-      </w:pPr>
-      <w:r>
-        <w:t xml:space="preserve">Anouar opnieuw benaderen en tonen dat ik zijn ervaring met Swiftnine serieus neem.</w:t>
+        <w:spacing w:after="80" w:line="276"/>
+      </w:pPr>
+      <w:r>
+        <w:t xml:space="preserve">Dat gesprek voorbereiden volgens de opbouw hierboven.</w:t>
+      </w:r>
+    </w:p>
+    <w:p>
+      <w:pPr>
+        <w:pStyle w:val="Heading2"/>
+      </w:pPr>
+      <w:r>
+        <w:t xml:space="preserve">Tot slot</w:t>
+      </w:r>
+    </w:p>
+    <w:p>
+      <w:pPr>
+        <w:spacing w:after="140" w:line="288"/>
+      </w:pPr>
+      <w:r>
+        <w:t xml:space="preserve">Dit gesprek liep niet zoals het moest. Dat is een feit.</w:t>
+      </w:r>
+    </w:p>
+    <w:p>
+      <w:pPr>
+        <w:spacing w:after="140" w:line="288"/>
+      </w:pPr>
+      <w:r>
+        <w:t xml:space="preserve">Wat telt is wat ik ermee doe. Meer luisteren. Medeleven tonen. Interesse laten zien. Aanwezig zijn, zonder scherm ertussen. Een houding die past bij het vertrouwen dat een klant ons geeft.</w:t>
+      </w:r>
+    </w:p>
+    <w:p>
+      <w:pPr>
+        <w:spacing w:after="140" w:line="288"/>
+      </w:pPr>
+      <w:r>
+        <w:t xml:space="preserve">Zo wil ik elk volgend gesprek voeren.</w:t>
       </w:r>
     </w:p>
     <w:sectPr>
+      <w:footerReference w:type="default" r:id="rId7"/>
       <w:pgSz w:w="11906" w:h="16838" w:orient="portrait"/>
-      <w:pgMar w:top="1440" w:right="1440" w:bottom="1440" w:left="1440" w:header="708" w:footer="708" w:gutter="0"/>
+      <w:pgMar w:top="1080" w:right="1440" w:bottom="1080" w:left="1440" w:header="708" w:footer="708" w:gutter="0"/>
       <w:pgNumType/>
       <w:docGrid w:linePitch="360"/>
     </w:sectPr>
@@ -858,6 +2627,35 @@
 </w:endnotes>
 </file>
 
+<file path=word/footer1.xml><?xml version="1.0" encoding="utf-8"?>
+<w:ftr xmlns:wpc="http://schemas.microsoft.com/office/word/2010/wordprocessingCanvas" xmlns:mc="http://schemas.openxmlformats.org/markup-compatibility/2006" xmlns:o="urn:schemas-microsoft-com:office:office" xmlns:r="http://schemas.openxmlformats.org/officeDocument/2006/relationships" xmlns:m="http://schemas.openxmlformats.org/officeDocument/2006/math" xmlns:v="urn:schemas-microsoft-com:vml" xmlns:wp14="http://schemas.microsoft.com/office/word/2010/wordprocessingDrawing" xmlns:wp="http://schemas.openxmlformats.org/drawingml/2006/wordprocessingDrawing" xmlns:w10="urn:schemas-microsoft-com:office:word" xmlns:w="http://schemas.openxmlformats.org/wordprocessingml/2006/main" xmlns:w14="http://schemas.microsoft.com/office/word/2010/wordml" xmlns:w15="http://schemas.microsoft.com/office/word/2012/wordml" xmlns:wpg="http://schemas.microsoft.com/office/word/2010/wordprocessingGroup" xmlns:wpi="http://schemas.microsoft.com/office/word/2010/wordprocessingInk" xmlns:wne="http://schemas.microsoft.com/office/word/2006/wordml" xmlns:wps="http://schemas.microsoft.com/office/word/2010/wordprocessingShape">
+  <w:p>
+    <w:pPr>
+      <w:jc w:val="right"/>
+    </w:pPr>
+    <w:r>
+      <w:rPr>
+        <w:color w:val="666666"/>
+        <w:sz w:val="18"/>
+        <w:szCs w:val="18"/>
+      </w:rPr>
+      <w:t xml:space="preserve">Verslag klantgesprek Anouar  ·  pagina </w:t>
+    </w:r>
+    <w:r>
+      <w:rPr>
+        <w:color w:val="666666"/>
+        <w:sz w:val="18"/>
+        <w:szCs w:val="18"/>
+      </w:rPr>
+      <w:fldChar w:fldCharType="begin"/>
+      <w:instrText xml:space="preserve">PAGE</w:instrText>
+      <w:fldChar w:fldCharType="separate"/>
+      <w:fldChar w:fldCharType="end"/>
+    </w:r>
+  </w:p>
+</w:ftr>
+</file>
+
 <file path=word/footnotes.xml><?xml version="1.0" encoding="utf-8"?>
 <w:footnotes xmlns:wpc="http://schemas.microsoft.com/office/word/2010/wordprocessingCanvas" xmlns:mc="http://schemas.openxmlformats.org/markup-compatibility/2006" xmlns:o="urn:schemas-microsoft-com:office:office" xmlns:r="http://schemas.openxmlformats.org/officeDocument/2006/relationships" xmlns:m="http://schemas.openxmlformats.org/officeDocument/2006/math" xmlns:v="urn:schemas-microsoft-com:vml" xmlns:wp14="http://schemas.microsoft.com/office/word/2010/wordprocessingDrawing" xmlns:wp="http://schemas.openxmlformats.org/drawingml/2006/wordprocessingDrawing" xmlns:w10="urn:schemas-microsoft-com:office:word" xmlns:w="http://schemas.openxmlformats.org/wordprocessingml/2006/main" xmlns:w14="http://schemas.microsoft.com/office/word/2010/wordml" xmlns:w15="http://schemas.microsoft.com/office/word/2012/wordml" xmlns:wpg="http://schemas.microsoft.com/office/word/2010/wordprocessingGroup" xmlns:wpi="http://schemas.microsoft.com/office/word/2010/wordprocessingInk" xmlns:wne="http://schemas.microsoft.com/office/word/2006/wordml" xmlns:wps="http://schemas.microsoft.com/office/word/2010/wordprocessingShape" mc:Ignorable="w14 w15 wp14">
   <w:footnote w:type="separator" w:id="-1">
@@ -993,6 +2791,18 @@
       </w:pPr>
     </w:lvl>
   </w:abstractNum>
+  <w:abstractNum w:abstractNumId="3" w15:restartNumberingAfterBreak="0">
+    <w:multiLevelType w:val="hybridMultilevel"/>
+    <w:lvl w:ilvl="0" w15:tentative="1">
+      <w:start w:val="1"/>
+      <w:numFmt w:val="bullet"/>
+      <w:lvlText w:val="•"/>
+      <w:lvlJc w:val="left"/>
+      <w:pPr>
+        <w:ind w:left="440" w:hanging="260"/>
+      </w:pPr>
+    </w:lvl>
+  </w:abstractNum>
   <w:num w:numId="1">
     <w:abstractNumId w:val="1"/>
     <w:lvlOverride w:ilvl="0">
@@ -1000,6 +2810,12 @@
     </w:lvlOverride>
   </w:num>
   <w:num w:numId="2">
+    <w:abstractNumId w:val="3"/>
+    <w:lvlOverride w:ilvl="0">
+      <w:startOverride w:val="1"/>
+    </w:lvlOverride>
+  </w:num>
+  <w:num w:numId="3">
     <w:abstractNumId w:val="2"/>
     <w:lvlOverride w:ilvl="0">
       <w:startOverride w:val="1"/>
@@ -1195,14 +3011,14 @@
     <w:name w:val="Title"/>
     <w:basedOn w:val="Normal"/>
     <w:pPr>
-      <w:spacing w:after="80"/>
+      <w:spacing w:after="60"/>
     </w:pPr>
     <w:rPr>
       <w:b/>
       <w:bCs/>
       <w:color w:val="1F2A44"/>
-      <w:sz w:val="40"/>
-      <w:szCs w:val="40"/>
+      <w:sz w:val="44"/>
+      <w:szCs w:val="44"/>
     </w:rPr>
   </w:style>
   <w:style w:type="paragraph" w:styleId="Heading2">
@@ -1211,10 +3027,11 @@
     <w:next w:val="Normal"/>
     <w:qFormat/>
     <w:pPr>
+      <w:keepNext/>
       <w:pBdr>
         <w:bottom w:val="single" w:color="C9D1DC" w:sz="6" w:space="4"/>
       </w:pBdr>
-      <w:spacing w:after="140" w:before="360"/>
+      <w:spacing w:after="160" w:before="360"/>
       <w:outlineLvl w:val="1"/>
     </w:pPr>
     <w:rPr>
@@ -1225,5 +3042,23 @@
       <w:szCs w:val="28"/>
     </w:rPr>
   </w:style>
+  <w:style w:type="paragraph" w:styleId="Heading3">
+    <w:name w:val="Heading 3"/>
+    <w:basedOn w:val="Normal"/>
+    <w:next w:val="Normal"/>
+    <w:qFormat/>
+    <w:pPr>
+      <w:keepNext/>
+      <w:spacing w:after="100" w:before="280"/>
+      <w:outlineLvl w:val="2"/>
+    </w:pPr>
+    <w:rPr>
+      <w:b/>
+      <w:bCs/>
+      <w:color w:val="1F2A44"/>
+      <w:sz w:val="24"/>
+      <w:szCs w:val="24"/>
+    </w:rPr>
+  </w:style>
 </w:styles>
 </file>
</xml_diff>

<commit_message>
Pas achtergrond klant aan: nominee-LLC en bedrijf in Hongkong
Co-Authored-By: Claude Opus 5.5 <noreply@anthropic.com>
Claude-Session: https://claude.ai/code/session_01EPbmVSJZpU3ZYgYyjANTDJ
</commit_message>
<xml_diff>
--- a/Verslag_klantgesprek_Anouar.docx
+++ b/Verslag_klantgesprek_Anouar.docx
@@ -62,7 +62,7 @@
         <w:jc w:val="both"/>
       </w:pPr>
       <w:r>
-        <w:t xml:space="preserve">Dit verslag is geen afrekening met mezelf. Het is een poging om eerlijk te zijn over mijn eigen gedrag, zodat ik ervan leer. Een eerste gesprek is vaak bepalend voor de vraag of een klant ons vertrouwt. Dat maakt het belangrijk om stil te staan bij wat er in dit gesprek gebeurde.</w:t>
+        <w:t xml:space="preserve">Dit verslag is geen afrekening met mezelf. Het is een poging om eerlijk te zijn over mijn eigen gedrag, zodat ik ervan leer. Een eerste gesprek bepaalt vaak of een klant ons vertrouwt.</w:t>
       </w:r>
     </w:p>
     <w:p>
@@ -79,16 +79,25 @@
         <w:jc w:val="both"/>
       </w:pPr>
       <w:r>
-        <w:t xml:space="preserve">Anouar had tot voor kort zijn administratie ondergebracht bij Swiftnine. Over die samenwerking was hij duidelijk ontevreden. Hij vertelde dat zijn aangiftes meerdere keren op het laatste moment werden ingediend en dat hij een keer een boete van de Belastingdienst kreeg voor een te late btw-aangifte. Contact met zijn vaste contactpersoon verliep moeizaam. Vragen bleven soms weken liggen.</w:t>
-      </w:r>
-    </w:p>
-    <w:p>
-      <w:pPr>
-        <w:spacing w:after="160" w:line="276"/>
-        <w:jc w:val="both"/>
-      </w:pPr>
-      <w:r>
-        <w:t xml:space="preserve">Daarnaast vertelde hij dat een eerdere accountant hem had geadviseerd om zijn eenmanszaak om te zetten naar een bv. Achteraf bleek dat advies voor zijn situatie niet gunstig. De kosten waren hoger dan verwacht en het fiscale voordeel viel tegen. Anouar gaf aan dat hij zich daardoor niet serieus genomen voelde. Hij had het gevoel dat er een standaardoplossing over hem heen werd gegooid, zonder dat iemand echt naar zijn bedrijf had gekeken.</w:t>
+        <w:t xml:space="preserve">Anouar had tot voor kort zijn administratie ondergebracht bij Swiftnine. Over die samenwerking was hij duidelijk ontevreden. Het grootste probleem was het advies dat hij daar kreeg. Swiftnine raadde hem aan om een LLC op te richten op naam van een vriend, die als nominee zou optreden. Daarnaast adviseerden zij hem om een bedrijf in Hongkong te openen.</w:t>
+      </w:r>
+    </w:p>
+    <w:p>
+      <w:pPr>
+        <w:spacing w:after="160" w:line="276"/>
+        <w:jc w:val="both"/>
+      </w:pPr>
+      <w:r>
+        <w:t xml:space="preserve">Dat advies is zorgwekkend. Bij een nominee-constructie staat het bedrijf juridisch op naam van iemand anders, terwijl Anouar in werkelijkheid de eigenaar is. Zijn vriend is dan formeel aansprakelijk en heeft juridisch zeggenschap over het bedrijf. Bovendien moet de werkelijke eigenaar in veel gevallen gewoon gemeld worden als uiteindelijk belanghebbende. Een bedrijf in Hongkong levert een ondernemer die in Nederland woont en werkt zelden fiscaal voordeel op. Zonder echte activiteiten daar blijft de winst in de regel in Nederland belast. Zo’n constructie kan al snel gezien worden als een poging om belasting te ontwijken of eigendom te verhullen, met alle gevolgen van dien.</w:t>
+      </w:r>
+    </w:p>
+    <w:p>
+      <w:pPr>
+        <w:spacing w:after="160" w:line="276"/>
+        <w:jc w:val="both"/>
+      </w:pPr>
+      <w:r>
+        <w:t xml:space="preserve">Anouar gaf aan dat hij zich hierdoor niet serieus genomen voelde. Hij had het gevoel dat er een ingewikkelde oplossing over hem heen werd gegooid, zonder dat iemand echt naar zijn bedrijf had gekeken. Het maakte hem onzeker over zijn eigen situatie.</w:t>
       </w:r>
     </w:p>
     <w:p>
@@ -123,7 +132,7 @@
         <w:jc w:val="both"/>
       </w:pPr>
       <w:r>
-        <w:t xml:space="preserve">Na ongeveer tien minuten begon hij uit zichzelf te vertellen over zijn ervaringen met Swiftnine. Hij vertelde over de boete, over de vragen die bleven liggen en over het gevoel dat hij er alleen voor stond. Later in het gesprek kwam hij ook terug op het advies over de bv. Hij was op dat moment open en eerlijk. Je kon merken dat het hem dwarszat.</w:t>
+        <w:t xml:space="preserve">Na ongeveer tien minuten begon hij uit zichzelf te vertellen over zijn ervaringen met Swiftnine. Hij vertelde over het advies om een LLC op naam van een vriend te zetten en over het bedrijf in Hongkong. Hij vertelde ook over het gevoel dat hij er alleen voor stond. Hij was op dat moment open en eerlijk. Je kon merken dat het hem dwarszat.</w:t>
       </w:r>
     </w:p>
     <w:p>
@@ -282,7 +291,7 @@
         <w:jc w:val="both"/>
       </w:pPr>
       <w:r>
-        <w:t xml:space="preserve">Tot slot vond ik het lastig om om te gaan met de emotie in zijn verhaal. Toen Anouar vertelde over de boete en het slechte advies, wist ik niet goed hoe ik moest reageren. In plaats van daar even bij stil te staan, ben ik snel doorgegaan naar wat voor mij vertrouwd voelde: uitleg over onze werkwijze. Dat was makkelijker voor mij, maar niet beter voor hem.</w:t>
+        <w:t xml:space="preserve">Tot slot vond ik het lastig om om te gaan met de emotie in zijn verhaal. Toen Anouar vertelde over de nominee-constructie en het bedrijf in Hongkong, wist ik niet goed hoe ik moest reageren. In plaats van daar even bij stil te staan, ben ik snel doorgegaan naar wat voor mij vertrouwd voelde: uitleg over onze werkwijze. Dat was makkelijker voor mij, maar niet beter voor hem.</w:t>
       </w:r>
     </w:p>
     <w:p>
@@ -317,7 +326,7 @@
         <w:jc w:val="both"/>
       </w:pPr>
       <w:r>
-        <w:t xml:space="preserve">Toen hij vertelde over Swiftnine en het verkeerde advies, had ik moeten stoppen met mijn eigen verhaal. Erkennen wat hij heeft meegemaakt. Doorvragen naar wat er precies misging en hoe dat voor hem was. Pas daarna had ik kunnen uitleggen hoe wij werken, en dan gericht op precies die punten die bij hem fout gingen: tijdige aangiftes, snelle reactie op vragen en advies dat past bij zijn situatie.</w:t>
+        <w:t xml:space="preserve">Toen hij vertelde over Swiftnine en het verkeerde advies, had ik moeten stoppen met mijn eigen verhaal. Erkennen wat hij heeft meegemaakt. Doorvragen naar wat er precies misging en hoe dat voor hem was. Pas daarna had ik kunnen uitleggen hoe wij werken, en dan gericht op precies die punten die bij hem fout gingen: eerlijk advies dat past bij zijn situatie, een structuur die klopt en duidelijke uitleg over de risico’s.</w:t>
       </w:r>
     </w:p>
     <w:p>
@@ -357,15 +366,6 @@
     </w:p>
     <w:p>
       <w:pPr>
-        <w:spacing w:after="160" w:line="276"/>
-        <w:jc w:val="both"/>
-      </w:pPr>
-      <w:r>
-        <w:t xml:space="preserve">Ook wil ik een collega vragen om bij een van mijn volgende kennismakingsgesprekken aan te schuiven. Niet om het gesprek over te nemen, maar om mij achteraf eerlijke feedback te geven. Wat je zelf niet ziet, ziet een ander vaak wel.</w:t>
-      </w:r>
-    </w:p>
-    <w:p>
-      <w:pPr>
         <w:pStyle w:val="Heading1"/>
       </w:pPr>
       <w:r>
@@ -387,7 +387,7 @@
         <w:jc w:val="both"/>
       </w:pPr>
       <w:r>
-        <w:t xml:space="preserve">In dat gesprek wil ik samen met hem kijken naar zijn huidige situatie. Hoe staat zijn administratie ervoor na de overstap? Zijn er nog openstaande zaken bij de Belastingdienst? En is de bv-structuur voor hem op dit moment nog de juiste keuze, of is er iets te verbeteren? Zo kan ik laten zien dat ik niet alleen beloof te luisteren, maar het ook echt doe.</w:t>
+        <w:t xml:space="preserve">In dat gesprek wil ik samen met hem kijken naar zijn huidige situatie. Hoe staat zijn administratie ervoor na de overstap? Is de LLC al opgericht en staat er al iets op naam van zijn vriend? Is het bedrijf in Hongkong al geopend? En welke structuur past wel bij zijn bedrijf? Zo kan ik laten zien dat ik niet alleen beloof te luisteren, maar het ook echt doe.</w:t>
       </w:r>
     </w:p>
     <w:p>
@@ -404,7 +404,7 @@
         <w:jc w:val="both"/>
       </w:pPr>
       <w:r>
-        <w:t xml:space="preserve">Als Anouar ingaat op mijn uitnodiging, wil ik dat gesprek goed voorbereiden. Ik schrijf vooraf op wat ik van het eerste gesprek weet: zijn ervaringen met Swiftnine, de boete voor de btw-aangifte, het advies over de bv en de omvang van zijn bedrijf. Zo laat ik direct zien dat ik heb onthouden wat hij vertelde.</w:t>
+        <w:t xml:space="preserve">Als Anouar ingaat op mijn uitnodiging, wil ik dat gesprek goed voorbereiden. Ik schrijf vooraf op wat ik van het eerste gesprek weet: zijn ervaringen met Swiftnine, het advies over de LLC op naam van zijn vriend, het bedrijf in Hongkong en de omvang van zijn bedrijf. Zo laat ik direct zien dat ik heb onthouden wat hij vertelde.</w:t>
       </w:r>
     </w:p>
     <w:p>

</xml_diff>

<commit_message>
Herschrijf verslag op basis van het werkelijke verloop: introductie en bankkoppeling
Co-Authored-By: Claude Opus 5.5 <noreply@anthropic.com>
Claude-Session: https://claude.ai/code/session_01EPbmVSJZpU3ZYgYyjANTDJ
</commit_message>
<xml_diff>
--- a/Verslag_klantgesprek_Anouar.docx
+++ b/Verslag_klantgesprek_Anouar.docx
@@ -19,7 +19,7 @@
           <w:i/>
           <w:iCs/>
         </w:rPr>
-        <w:t xml:space="preserve">Zelfreflectie op het kennismakingsgesprek van 7 oktober 2026</w:t>
+        <w:t xml:space="preserve">Zelfreflectie op de introductie en het koppelen van de banken</w:t>
       </w:r>
     </w:p>
     <w:p>
@@ -44,25 +44,16 @@
         <w:jc w:val="both"/>
       </w:pPr>
       <w:r>
-        <w:t xml:space="preserve">Op dinsdag 7 oktober 2026 had ik een kennismakingsgesprek met Anouar. Het gesprek vond plaats op ons kantoor en duurde ongeveer drie kwartier. Anouar is eigenaar van een installatiebedrijf met drie medewerkers en is op zoek naar een nieuwe accountant. Hij kwam bij ons terecht via een doorverwijzing van een bestaande klant.</w:t>
-      </w:r>
-    </w:p>
-    <w:p>
-      <w:pPr>
-        <w:spacing w:after="160" w:line="276"/>
-        <w:jc w:val="both"/>
-      </w:pPr>
-      <w:r>
-        <w:t xml:space="preserve">Achteraf moet ik eerlijk vaststellen dat dit gesprek niet goed is verlopen. Niet omdat de inhoud niet klopte, maar omdat ik als gesprekspartner tekortschoot. Anouar kwam met een duidelijke vraag en een duidelijke zorg. Ik heb hem niet de aandacht gegeven die hij verdiende. In dit verslag kijk ik terug op wat er gebeurde, waarom het misging en wat ik in de toekomst anders ga doen.</w:t>
-      </w:r>
-    </w:p>
-    <w:p>
-      <w:pPr>
-        <w:spacing w:after="160" w:line="276"/>
-        <w:jc w:val="both"/>
-      </w:pPr>
-      <w:r>
-        <w:t xml:space="preserve">Dit verslag is geen afrekening met mezelf. Het is een poging om eerlijk te zijn over mijn eigen gedrag, zodat ik ervan leer. Een eerste gesprek bepaalt vaak of een klant ons vertrouwt.</w:t>
+        <w:t xml:space="preserve">In dit verslag kijk ik terug op mijn gesprek met Anouar. Het gesprek vond plaats via een videocall en bestond uit twee delen: de introductie en het koppelen van zijn bankrekeningen. In beide delen ging er iets mis. Niet in de inhoud, maar in de manier waarop ik het gesprek voerde.</w:t>
+      </w:r>
+    </w:p>
+    <w:p>
+      <w:pPr>
+        <w:spacing w:after="160" w:line="276"/>
+        <w:jc w:val="both"/>
+      </w:pPr>
+      <w:r>
+        <w:t xml:space="preserve">Ik wil eerlijk zijn over wat er gebeurde. Niet om mezelf af te kraken, maar om ervan te leren. Het belangrijkste wat ik achteraf zie, is dat ik alles wat misging zelf had kunnen voorkomen. Dat maakt het confronterend, maar ook hoopvol. Het ligt in mijn eigen handen om het de volgende keer beter te doen.</w:t>
       </w:r>
     </w:p>
     <w:p>
@@ -88,25 +79,16 @@
         <w:jc w:val="both"/>
       </w:pPr>
       <w:r>
-        <w:t xml:space="preserve">Dat advies is zorgwekkend. Bij een nominee-constructie staat het bedrijf juridisch op naam van iemand anders, terwijl Anouar in werkelijkheid de eigenaar is. Zijn vriend is dan formeel aansprakelijk en heeft juridisch zeggenschap over het bedrijf. Bovendien moet de werkelijke eigenaar in veel gevallen gewoon gemeld worden als uiteindelijk belanghebbende. Een bedrijf in Hongkong levert een ondernemer die in Nederland woont en werkt zelden fiscaal voordeel op. Zonder echte activiteiten daar blijft de winst in de regel in Nederland belast. Zo’n constructie kan al snel gezien worden als een poging om belasting te ontwijken of eigendom te verhullen, met alle gevolgen van dien.</w:t>
-      </w:r>
-    </w:p>
-    <w:p>
-      <w:pPr>
-        <w:spacing w:after="160" w:line="276"/>
-        <w:jc w:val="both"/>
-      </w:pPr>
-      <w:r>
-        <w:t xml:space="preserve">Anouar gaf aan dat hij zich hierdoor niet serieus genomen voelde. Hij had het gevoel dat er een ingewikkelde oplossing over hem heen werd gegooid, zonder dat iemand echt naar zijn bedrijf had gekeken. Het maakte hem onzeker over zijn eigen situatie.</w:t>
-      </w:r>
-    </w:p>
-    <w:p>
-      <w:pPr>
-        <w:spacing w:after="160" w:line="276"/>
-        <w:jc w:val="both"/>
-      </w:pPr>
-      <w:r>
-        <w:t xml:space="preserve">Met andere woorden: Anouar kwam niet alleen voor een nieuwe accountant. Hij kwam voor vertrouwen. Hij wilde weten of hij hier wel gehoord zou worden. Dat had ik moeten zien. Ik heb het niet gezien.</w:t>
+        <w:t xml:space="preserve">Dat advies is zorgwekkend. Bij een nominee-constructie staat het bedrijf juridisch op naam van iemand anders, terwijl Anouar in werkelijkheid de eigenaar is. Zijn vriend is dan formeel aansprakelijk en heeft juridisch zeggenschap over het bedrijf. Een bedrijf in Hongkong levert een ondernemer die in Nederland woont en werkt zelden fiscaal voordeel op. Zo’n constructie kan al snel gezien worden als een poging om belasting te ontwijken of eigendom te verhullen.</w:t>
+      </w:r>
+    </w:p>
+    <w:p>
+      <w:pPr>
+        <w:spacing w:after="160" w:line="276"/>
+        <w:jc w:val="both"/>
+      </w:pPr>
+      <w:r>
+        <w:t xml:space="preserve">Met andere woorden: Anouar kwam niet alleen voor een nieuwe accountant. Hij kwam voor vertrouwen. Hij wilde weten of hij bij ons wel serieus genomen zou worden. Dat had ik vanaf het begin van het gesprek moeten voelen en laten merken.</w:t>
       </w:r>
     </w:p>
     <w:p>
@@ -114,43 +96,129 @@
         <w:pStyle w:val="Heading1"/>
       </w:pPr>
       <w:r>
-        <w:t xml:space="preserve">Verloop van het gesprek</w:t>
-      </w:r>
-    </w:p>
-    <w:p>
-      <w:pPr>
-        <w:spacing w:after="160" w:line="276"/>
-        <w:jc w:val="both"/>
-      </w:pPr>
-      <w:r>
-        <w:t xml:space="preserve">Het gesprek begon zakelijk. Ik had mijn laptop open op tafel staan en begon vrij snel met uitleggen hoe wij werken. Ik vertelde over onze aanpak voor de administratie, de jaarafsluiting en de fiscale begeleiding. Anouar luisterde en knikte, maar zei in het begin weinig.</w:t>
-      </w:r>
-    </w:p>
-    <w:p>
-      <w:pPr>
-        <w:spacing w:after="160" w:line="276"/>
-        <w:jc w:val="both"/>
-      </w:pPr>
-      <w:r>
-        <w:t xml:space="preserve">Na ongeveer tien minuten begon hij uit zichzelf te vertellen over zijn ervaringen met Swiftnine. Hij vertelde over het advies om een LLC op naam van een vriend te zetten en over het bedrijf in Hongkong. Hij vertelde ook over het gevoel dat hij er alleen voor stond. Hij was op dat moment open en eerlijk. Je kon merken dat het hem dwarszat.</w:t>
-      </w:r>
-    </w:p>
-    <w:p>
-      <w:pPr>
-        <w:spacing w:after="160" w:line="276"/>
-        <w:jc w:val="both"/>
-      </w:pPr>
-      <w:r>
-        <w:t xml:space="preserve">Ik reageerde daar nauwelijks op. Ik zei iets als "dat is bij ons anders" en ging verder met mijn eigen verhaal. Ik stelde geen vervolgvragen en liet niet merken dat ik begreep hoe vervelend dit voor hem moet zijn geweest. In de tweede helft van het gesprek was ik regelmatig bezig op mijn laptop om dingen op te zoeken of aantekeningen te maken. Daardoor vielen er stiltes die ik niet opving. Ook merkte ik dat ik bepaalde punten twee of drie keer herhaalde, onder andere over onze maandelijkse rapportage en onze tarieven.</w:t>
-      </w:r>
-    </w:p>
-    <w:p>
-      <w:pPr>
-        <w:spacing w:after="160" w:line="276"/>
-        <w:jc w:val="both"/>
-      </w:pPr>
-      <w:r>
-        <w:t xml:space="preserve">Het gesprek eindigde vriendelijk, maar zonder duidelijke afspraak. Anouar gaf aan dat hij er nog over na wilde denken. Toen hij weg was, had ik zelf al het gevoel dat het niet goed was gegaan.</w:t>
+        <w:t xml:space="preserve">Deel 1: De introductie</w:t>
+      </w:r>
+    </w:p>
+    <w:p>
+      <w:pPr>
+        <w:pStyle w:val="Heading2"/>
+      </w:pPr>
+      <w:r>
+        <w:t xml:space="preserve">Wat er gebeurde</w:t>
+      </w:r>
+    </w:p>
+    <w:p>
+      <w:pPr>
+        <w:spacing w:after="160" w:line="276"/>
+        <w:jc w:val="both"/>
+      </w:pPr>
+      <w:r>
+        <w:t xml:space="preserve">Ik ben de call begonnen door te vragen hoe het met Anouar ging. Daarna heb ik hem gevraagd om te starten met het uitleggen van zijn situatie. Dat heeft hij gedaan. Hij vertelde open over zijn ervaringen en over het advies dat hij eerder had gekregen.</w:t>
+      </w:r>
+    </w:p>
+    <w:p>
+      <w:pPr>
+        <w:spacing w:after="160" w:line="276"/>
+        <w:jc w:val="both"/>
+      </w:pPr>
+      <w:r>
+        <w:t xml:space="preserve">De opening van het gesprek was op zich goed. Door Anouar zelf te laten vertellen, gaf ik hem de ruimte. Maar wat daarna kwam, was niet goed genoeg. Juist op het moment dat hij zich opende, schoot ik tekort.</w:t>
+      </w:r>
+    </w:p>
+    <w:p>
+      <w:pPr>
+        <w:pStyle w:val="Heading2"/>
+      </w:pPr>
+      <w:r>
+        <w:t xml:space="preserve">Wat er misging</w:t>
+      </w:r>
+    </w:p>
+    <w:p>
+      <w:pPr>
+        <w:spacing w:after="160" w:line="276"/>
+        <w:jc w:val="both"/>
+      </w:pPr>
+      <w:r>
+        <w:t xml:space="preserve">Het eerste probleem was dat ik geen medeleven toonde over zijn ervaring. Anouar vertelde over een situatie die hem duidelijk had geraakt. Hij had vertrouwd op advies dat niet in zijn belang was. Op zo’n moment verwacht een klant erkenning. Een simpele reactie had al veel verschil gemaakt. Ik gaf die reactie niet. Daardoor kan hij het gevoel hebben gekregen dat zijn verhaal mij niet raakte.</w:t>
+      </w:r>
+    </w:p>
+    <w:p>
+      <w:pPr>
+        <w:spacing w:after="160" w:line="276"/>
+        <w:jc w:val="both"/>
+      </w:pPr>
+      <w:r>
+        <w:t xml:space="preserve">Het tweede probleem was mijn houding. Die was niet netjes. In een videocall ziet de klant alleen mijn gezicht en een klein deel van mijn omgeving. Elke houding valt daardoor extra op. Een onverschillige of slordige houding komt via een scherm nog sterker over dan aan tafel.</w:t>
+      </w:r>
+    </w:p>
+    <w:p>
+      <w:pPr>
+        <w:spacing w:after="160" w:line="276"/>
+        <w:jc w:val="both"/>
+      </w:pPr>
+      <w:r>
+        <w:t xml:space="preserve">Het derde probleem was mijn camera. Die was niet schoon. Daardoor was het beeld minder scherp en minder professioneel. Het lijkt een klein detail, maar in een videocall is de camera het eerste wat de klant van mij ziet. Een vies beeld geeft de indruk dat ik me niet goed heb voorbereid op het gesprek.</w:t>
+      </w:r>
+    </w:p>
+    <w:p>
+      <w:pPr>
+        <w:spacing w:after="160" w:line="276"/>
+        <w:jc w:val="both"/>
+      </w:pPr>
+      <w:r>
+        <w:t xml:space="preserve">Het vierde en misschien belangrijkste probleem was mijn uitstraling. Ik kwam over alsof ik geen interesse had in het verhaal van Anouar. Dat was niet mijn bedoeling, maar het is wel hoe het overkwam. En in een klantgesprek telt niet wat ik bedoel, maar wat de klant ervaart.</w:t>
+      </w:r>
+    </w:p>
+    <w:p>
+      <w:pPr>
+        <w:pStyle w:val="Heading2"/>
+      </w:pPr>
+      <w:r>
+        <w:t xml:space="preserve">Waarom dit telt</w:t>
+      </w:r>
+    </w:p>
+    <w:p>
+      <w:pPr>
+        <w:spacing w:after="160" w:line="276"/>
+        <w:jc w:val="both"/>
+      </w:pPr>
+      <w:r>
+        <w:t xml:space="preserve">De introductie is het moment waarop de klant zijn eerste indruk vormt. Voor Anouar woog dat moment extra zwaar. Hij had eerder advies gekregen dat niet in zijn belang was. Hij kwam bij ons met de vraag of het hier anders zou zijn. Als ik dan niet laat merken dat zijn verhaal mij raakt, bevestig ik onbewust zijn twijfel.</w:t>
+      </w:r>
+    </w:p>
+    <w:p>
+      <w:pPr>
+        <w:spacing w:after="160" w:line="276"/>
+        <w:jc w:val="both"/>
+      </w:pPr>
+      <w:r>
+        <w:t xml:space="preserve">Vertrouwen ontstaat niet door uit te leggen hoe goed wij zijn. Het ontstaat doordat de klant merkt dat hij gehoord wordt. Die kans lag in de introductie voor het oprapen. Anouar gaf mij zelf de opening door zo open te vertellen. Ik heb die opening niet benut.</w:t>
+      </w:r>
+    </w:p>
+    <w:p>
+      <w:pPr>
+        <w:pStyle w:val="Heading2"/>
+      </w:pPr>
+      <w:r>
+        <w:t xml:space="preserve">Dit had ik kunnen voorkomen</w:t>
+      </w:r>
+    </w:p>
+    <w:p>
+      <w:pPr>
+        <w:spacing w:after="160" w:line="276"/>
+        <w:jc w:val="both"/>
+      </w:pPr>
+      <w:r>
+        <w:t xml:space="preserve">Alles wat in de introductie misging, had ik kunnen voorkomen. Ik had moeten reageren op wat Anouar vertelde. Even stilstaan bij zijn ervaring. Benoemen dat het vervelend is om advies te krijgen dat niet in je belang is. Doorvragen naar hoe dat voor hem was. Pas daarna had ik verder moeten gaan.</w:t>
+      </w:r>
+    </w:p>
+    <w:p>
+      <w:pPr>
+        <w:spacing w:after="160" w:line="276"/>
+        <w:jc w:val="both"/>
+      </w:pPr>
+      <w:r>
+        <w:t xml:space="preserve">Mijn houding had ik vooraf kunnen controleren. Rechtop zitten, recht in de camera kijken en actief laten zien dat ik luister, bijvoorbeeld door te knikken en kort te bevestigen wat hij zegt. Mijn camera had ik voor het gesprek schoon kunnen maken. Dat kost tien seconden. Door die dingen bewust te doen, had ik laten zien dat zijn verhaal mij wel degelijk interesseert.</w:t>
       </w:r>
     </w:p>
     <w:p>
@@ -158,6 +226,40 @@
         <w:pStyle w:val="Heading1"/>
       </w:pPr>
       <w:r>
+        <w:t xml:space="preserve">Deel 2: Het koppelen van de banken</w:t>
+      </w:r>
+    </w:p>
+    <w:p>
+      <w:pPr>
+        <w:pStyle w:val="Heading2"/>
+      </w:pPr>
+      <w:r>
+        <w:t xml:space="preserve">Wat er gebeurde</w:t>
+      </w:r>
+    </w:p>
+    <w:p>
+      <w:pPr>
+        <w:spacing w:after="160" w:line="276"/>
+        <w:jc w:val="both"/>
+      </w:pPr>
+      <w:r>
+        <w:t xml:space="preserve">Na de introductie gingen we verder met het koppelen van de bankrekeningen. Dit is een praktisch onderdeel van de onboarding. Voor de klant is het vaak een moment waarop hij voor het eerst ziet hoe wij werken. Het is daarmee een kans om te laten zien dat alles bij ons soepel en professioneel verloopt.</w:t>
+      </w:r>
+    </w:p>
+    <w:p>
+      <w:pPr>
+        <w:spacing w:after="160" w:line="276"/>
+        <w:jc w:val="both"/>
+      </w:pPr>
+      <w:r>
+        <w:t xml:space="preserve">Tijdens dit onderdeel ging er op meerdere punten iets mis. Ik heb Anouar drie keer hetzelfde gevraagd. Ik zat tijdens het gesprek met mijn collega te discussiëren over problemen die tevoorschijn kwamen. En er vielen veel stiltes, terwijl ik die had kunnen vullen met een praatje.</w:t>
+      </w:r>
+    </w:p>
+    <w:p>
+      <w:pPr>
+        <w:pStyle w:val="Heading2"/>
+      </w:pPr>
+      <w:r>
         <w:t xml:space="preserve">Wat er misging</w:t>
       </w:r>
     </w:p>
@@ -167,52 +269,86 @@
         <w:jc w:val="both"/>
       </w:pPr>
       <w:r>
-        <w:t xml:space="preserve">Het eerste en belangrijkste punt is dat ik niet goed heb geluisterd. Anouar gaf mij informatie die van grote waarde was. Hij vertelde precies wat hij van een accountant verwacht en wat hij niet nog eens wil meemaken. In plaats van daarop in te gaan, bleef ik bij mijn eigen verhaal. Ik was meer bezig met wat ik wilde vertellen dan met wat hij nodig had.</w:t>
-      </w:r>
-    </w:p>
-    <w:p>
-      <w:pPr>
-        <w:spacing w:after="160" w:line="276"/>
-        <w:jc w:val="both"/>
-      </w:pPr>
-      <w:r>
-        <w:t xml:space="preserve">Het tweede punt is dat ik geen medeleven heb getoond. Toen Anouar zich opende over zijn slechte ervaring met Swiftnine en het verkeerde advies, was dat het moment om even stil te staan. Een simpele erkenning had veel kunnen doen. Iets als: "Dat is vervelend. Je rekent op goed advies en dan blijkt het niet te kloppen." Door daar overheen te stappen, heb ik hem eigenlijk bevestigd in zijn idee dat accountants niet echt luisteren.</w:t>
-      </w:r>
-    </w:p>
-    <w:p>
-      <w:pPr>
-        <w:spacing w:after="160" w:line="276"/>
-        <w:jc w:val="both"/>
-      </w:pPr>
-      <w:r>
-        <w:t xml:space="preserve">Het derde punt is dat ik geen interesse heb getoond in hem als persoon en als ondernemer. Ik heb nauwelijks vragen gesteld over zijn bedrijf, zijn medewerkers, zijn plannen of zijn zorgen. Daardoor weet ik na het gesprek eigenlijk te weinig om hem goed te kunnen adviseren. Belangrijker nog: hij zal het gevoel hebben gehad dat het gesprek niet over hem ging.</w:t>
-      </w:r>
-    </w:p>
-    <w:p>
-      <w:pPr>
-        <w:spacing w:after="160" w:line="276"/>
-        <w:jc w:val="both"/>
-      </w:pPr>
-      <w:r>
-        <w:t xml:space="preserve">Het vierde punt zijn de stiltes. Doordat ik met mijn laptop bezig was, ontstonden er momenten waarop er niets gebeurde. Voor Anouar moet dat ongemakkelijk zijn geweest. Een scherm tussen twee mensen zegt al snel dat iets anders belangrijker is. Ik had die momenten moeten gebruiken om een praatje te maken, iets te vragen of gewoon contact te houden.</w:t>
-      </w:r>
-    </w:p>
-    <w:p>
-      <w:pPr>
-        <w:spacing w:after="160" w:line="276"/>
-        <w:jc w:val="both"/>
-      </w:pPr>
-      <w:r>
-        <w:t xml:space="preserve">Het vijfde punt is mijn herhaling. Ik zei sommige dingen twee of drie keer. Dat kwam omdat ik mijn verhaal vooraf niet goed had geordend. Het maakte het gesprek rommelig en het gaf de indruk dat ik niet goed voorbereid was.</w:t>
-      </w:r>
-    </w:p>
-    <w:p>
-      <w:pPr>
-        <w:spacing w:after="160" w:line="276"/>
-        <w:jc w:val="both"/>
-      </w:pPr>
-      <w:r>
-        <w:t xml:space="preserve">Het zesde punt is mijn houding. Ik zat niet open en niet netjes aan tafel. Ik was half naar mijn scherm gedraaid en leunde achterover op momenten dat Anouar iets persoonlijks vertelde. Lichaamstaal zegt vaak meer dan woorden. Mijn houding paste niet bij de professionele en betrokken uitstraling die ik wil hebben.</w:t>
+        <w:t xml:space="preserve">Dat ik Anouar drie keer hetzelfde vroeg, was onprofessioneel. Het gaf de indruk dat ik niet goed luisterde of niet goed bijhield wat hij al had gezegd. Voor een klant die al eerder slechte ervaringen heeft gehad, is dat precies het verkeerde signaal. Hij moet erop kunnen vertrouwen dat wij zijn informatie zorgvuldig vastleggen.</w:t>
+      </w:r>
+    </w:p>
+    <w:p>
+      <w:pPr>
+        <w:spacing w:after="160" w:line="276"/>
+        <w:jc w:val="both"/>
+      </w:pPr>
+      <w:r>
+        <w:t xml:space="preserve">Dat ik met mijn collega discussieerde over de problemen, was ook niet goed. Problemen tijdens het koppelen kunnen gebeuren. Dat is niet erg. Maar de klant hoort geen getuige te zijn van een interne discussie. Het maakt onrustig en wekt de indruk dat wij zelf niet goed weten wat we doen. Bovendien was mijn aandacht op dat moment bij mijn collega, en niet bij Anouar.</w:t>
+      </w:r>
+    </w:p>
+    <w:p>
+      <w:pPr>
+        <w:spacing w:after="160" w:line="276"/>
+        <w:jc w:val="both"/>
+      </w:pPr>
+      <w:r>
+        <w:t xml:space="preserve">Dan waren er de stiltes. Er vielen super veel stiltes tijdens het koppelen. Terwijl ik bezig was, zat Anouar te wachten zonder dat er iets gebeurde. In een videocall voelt een stilte nog langer en ongemakkelijker dan in een gewoon gesprek. De klant weet niet wat er aan de hand is en voelt zich al snel overbodig.</w:t>
+      </w:r>
+    </w:p>
+    <w:p>
+      <w:pPr>
+        <w:pStyle w:val="Heading2"/>
+      </w:pPr>
+      <w:r>
+        <w:t xml:space="preserve">Waarom dit telt</w:t>
+      </w:r>
+    </w:p>
+    <w:p>
+      <w:pPr>
+        <w:spacing w:after="160" w:line="276"/>
+        <w:jc w:val="both"/>
+      </w:pPr>
+      <w:r>
+        <w:t xml:space="preserve">Het koppelen van de banken lijkt een technisch onderdeel, maar voor de klant is het meer dan dat. Het is het eerste moment waarop hij ziet hoe wij in de praktijk werken. Hij geeft ons toegang tot zijn financiële gegevens. Dat vraagt vertrouwen. Als het proces rommelig verloopt, vraagt hij zich af hoe zorgvuldig wij straks met zijn administratie omgaan.</w:t>
+      </w:r>
+    </w:p>
+    <w:p>
+      <w:pPr>
+        <w:spacing w:after="160" w:line="276"/>
+        <w:jc w:val="both"/>
+      </w:pPr>
+      <w:r>
+        <w:t xml:space="preserve">Herhaalde vragen, een zichtbare discussie en lange stiltes versterken elkaar. Samen geven ze het beeld van een kantoor dat het niet op orde heeft. Dat is precies het beeld dat ik bij Anouar wilde wegnemen na zijn ervaring met Swiftnine.</w:t>
+      </w:r>
+    </w:p>
+    <w:p>
+      <w:pPr>
+        <w:pStyle w:val="Heading2"/>
+      </w:pPr>
+      <w:r>
+        <w:t xml:space="preserve">Dit had ik kunnen voorkomen</w:t>
+      </w:r>
+    </w:p>
+    <w:p>
+      <w:pPr>
+        <w:spacing w:after="160" w:line="276"/>
+        <w:jc w:val="both"/>
+      </w:pPr>
+      <w:r>
+        <w:t xml:space="preserve">Ook deze punten had ik kunnen voorkomen. De herhaalde vragen had ik kunnen voorkomen door direct aantekeningen te maken van wat Anouar zei. Dan had ik zijn antwoord terug kunnen lezen in plaats van het opnieuw te vragen. Bij twijfel had ik kunnen samenvatten wat ik had genoteerd en hem kunnen vragen of dat klopte.</w:t>
+      </w:r>
+    </w:p>
+    <w:p>
+      <w:pPr>
+        <w:spacing w:after="160" w:line="276"/>
+        <w:jc w:val="both"/>
+      </w:pPr>
+      <w:r>
+        <w:t xml:space="preserve">De discussie met mijn collega had ik kunnen voorkomen door die buiten het gesprek te houden. Als er een probleem is, kan ik dat rustig benoemen tegen de klant. Bijvoorbeeld door te zeggen dat er iets niet direct lukt en dat ik het na de call oplos. Overleg met mijn collega hoort daarna plaats te vinden, of in een apart bericht, zonder dat de klant erbij is.</w:t>
+      </w:r>
+    </w:p>
+    <w:p>
+      <w:pPr>
+        <w:spacing w:after="160" w:line="276"/>
+        <w:jc w:val="both"/>
+      </w:pPr>
+      <w:r>
+        <w:t xml:space="preserve">De stiltes had ik kunnen voorkomen door een praatje te maken. Terwijl de koppeling laadt of ik iets controleer, kan ik Anouar vragen hoe zijn week gaat, hoe het met zijn bedrijf gaat of wat hij verwacht van onze samenwerking. Ook kan ik hardop vertellen wat ik aan het doen ben. Zo blijft de klant betrokken en voelt de wachttijd niet als stilstand.</w:t>
       </w:r>
     </w:p>
     <w:p>
@@ -220,34 +356,34 @@
         <w:pStyle w:val="Heading1"/>
       </w:pPr>
       <w:r>
-        <w:t xml:space="preserve">Waarom dit belangrijk is</w:t>
-      </w:r>
-    </w:p>
-    <w:p>
-      <w:pPr>
-        <w:spacing w:after="160" w:line="276"/>
-        <w:jc w:val="both"/>
-      </w:pPr>
-      <w:r>
-        <w:t xml:space="preserve">Een klant die eerder is teleurgesteld, let extra scherp op. Anouar zat niet aan tafel om een folder te horen. Hij wilde weten of hij ons kon vertrouwen. Elke stilte, elke herhaling en elke blik op mijn scherm woog voor hem zwaarder dan voor een klant zonder die geschiedenis.</w:t>
-      </w:r>
-    </w:p>
-    <w:p>
-      <w:pPr>
-        <w:spacing w:after="160" w:line="276"/>
-        <w:jc w:val="both"/>
-      </w:pPr>
-      <w:r>
-        <w:t xml:space="preserve">Vertrouwen ontstaat niet door uit te leggen hoe goed wij zijn. Het ontstaat doordat de klant merkt dat hij gehoord wordt. Als ik niet laat zien dat ik luister, maakt het niet uit hoe goed onze dienstverlening is. De klant haakt dan al af voordat hij die dienstverlening ooit heeft ervaren.</w:t>
-      </w:r>
-    </w:p>
-    <w:p>
-      <w:pPr>
-        <w:spacing w:after="160" w:line="276"/>
-        <w:jc w:val="both"/>
-      </w:pPr>
-      <w:r>
-        <w:t xml:space="preserve">Daarnaast heeft dit gesprek ook zakelijke gevolgen. Anouar is een ondernemer met een gezond bedrijf en een duidelijke behoefte. Hij is precies het type klant waar wij goed bij kunnen helpen. Door mijn manier van gesprek voeren loop ik het risico dat hij voor een ander kantoor kiest. Bovendien kwam hij via een doorverwijzing. Een slechte eerste indruk raakt dus niet alleen hem, maar mogelijk ook de relatie met de klant die hem doorverwees.</w:t>
+        <w:t xml:space="preserve">Wat ik hiervan leer</w:t>
+      </w:r>
+    </w:p>
+    <w:p>
+      <w:pPr>
+        <w:spacing w:after="160" w:line="276"/>
+        <w:jc w:val="both"/>
+      </w:pPr>
+      <w:r>
+        <w:t xml:space="preserve">Als ik naar het hele gesprek kijk, zie ik één rode draad. Ik was te veel bezig met de taak en te weinig met de klant. In de introductie luisterde ik naar zijn verhaal zonder er echt op te reageren. Bij het koppelen van de banken was ik bezig met de techniek, met mijn collega en met de problemen. In beide gevallen stond Anouar niet centraal.</w:t>
+      </w:r>
+    </w:p>
+    <w:p>
+      <w:pPr>
+        <w:spacing w:after="160" w:line="276"/>
+        <w:jc w:val="both"/>
+      </w:pPr>
+      <w:r>
+        <w:t xml:space="preserve">Een klant onthoudt niet hoe snel een bankkoppeling werkte. Een klant onthoudt hoe hij zich voelde tijdens het gesprek. Voelde hij zich gehoord? Voelde hij zich welkom? Had hij het gevoel dat de persoon tegenover hem echt geïnteresseerd was? Op die vragen zou Anouar na dit gesprek waarschijnlijk geen volmondig ja antwoorden.</w:t>
+      </w:r>
+    </w:p>
+    <w:p>
+      <w:pPr>
+        <w:spacing w:after="160" w:line="276"/>
+        <w:jc w:val="both"/>
+      </w:pPr>
+      <w:r>
+        <w:t xml:space="preserve">Het goede nieuws is dat alles wat misging binnen mijn eigen invloed ligt. Medeleven tonen, een nette houding, een schone camera, aantekeningen maken, interne discussies vermijden en een praatje maken. Geen van deze dingen vraagt extra kennis. Ze vragen alleen aandacht en voorbereiding.</w:t>
       </w:r>
     </w:p>
     <w:p>
@@ -255,43 +391,34 @@
         <w:pStyle w:val="Heading1"/>
       </w:pPr>
       <w:r>
-        <w:t xml:space="preserve">Waarom het misging</w:t>
-      </w:r>
-    </w:p>
-    <w:p>
-      <w:pPr>
-        <w:spacing w:after="160" w:line="276"/>
-        <w:jc w:val="both"/>
-      </w:pPr>
-      <w:r>
-        <w:t xml:space="preserve">Als ik eerlijk naar mezelf kijk, zie ik een aantal oorzaken. Ten eerste wilde ik graag laten zien wat wij te bieden hebben. Ik was zo gericht op het overbrengen van mijn eigen verhaal, dat ik vergat dat een goed gesprek bij de klant begint. Ik dacht dat een sterke uitleg de klant zou overtuigen. Achteraf weet ik dat een klant niet overtuigd wordt door wat ik vertel, maar door hoe hij zich voelt na het gesprek.</w:t>
-      </w:r>
-    </w:p>
-    <w:p>
-      <w:pPr>
-        <w:spacing w:after="160" w:line="276"/>
-        <w:jc w:val="both"/>
-      </w:pPr>
-      <w:r>
-        <w:t xml:space="preserve">Ten tweede was ik niet goed voorbereid. Ik wist vooraf alleen dat Anouar een installatiebedrijf had en via een doorverwijzing kwam. Ik had geen vragen voorbereid en geen duidelijke structuur voor het gesprek. Daardoor greep ik terug op mijn vaste verhaal, en dat verhaal herhaalde ik zodra er een stilte viel.</w:t>
-      </w:r>
-    </w:p>
-    <w:p>
-      <w:pPr>
-        <w:spacing w:after="160" w:line="276"/>
-        <w:jc w:val="both"/>
-      </w:pPr>
-      <w:r>
-        <w:t xml:space="preserve">Ten derde gebruik ik mijn laptop als houvast. Het voelt efficiënt om tijdens een gesprek aantekeningen te maken of iets op te zoeken. In de praktijk haalt het mij uit het gesprek. Ik merk dat ik naar mijn scherm kijk op momenten dat ik onzeker ben of niet direct weet wat ik moet zeggen. Juist op die momenten zou ik de klant moeten aankijken.</w:t>
-      </w:r>
-    </w:p>
-    <w:p>
-      <w:pPr>
-        <w:spacing w:after="160" w:line="276"/>
-        <w:jc w:val="both"/>
-      </w:pPr>
-      <w:r>
-        <w:t xml:space="preserve">Tot slot vond ik het lastig om om te gaan met de emotie in zijn verhaal. Toen Anouar vertelde over de nominee-constructie en het bedrijf in Hongkong, wist ik niet goed hoe ik moest reageren. In plaats van daar even bij stil te staan, ben ik snel doorgegaan naar wat voor mij vertrouwd voelde: uitleg over onze werkwijze. Dat was makkelijker voor mij, maar niet beter voor hem.</w:t>
+        <w:t xml:space="preserve">Voorbereiding op een videocall</w:t>
+      </w:r>
+    </w:p>
+    <w:p>
+      <w:pPr>
+        <w:spacing w:after="160" w:line="276"/>
+        <w:jc w:val="both"/>
+      </w:pPr>
+      <w:r>
+        <w:t xml:space="preserve">Omdat dit gesprek via een videocall plaatsvond, wil ik voortaan een vaste voorbereiding aanhouden. Een paar minuten voor de call maak ik mijn camera schoon en controleer ik mijn beeld. Ik kijk of mijn houding en mijn omgeving er netjes uitzien. Ik zorg dat ik de gegevens van de klant bij de hand heb en dat ik weet welke stappen we in het gesprek gaan doorlopen.</w:t>
+      </w:r>
+    </w:p>
+    <w:p>
+      <w:pPr>
+        <w:spacing w:after="160" w:line="276"/>
+        <w:jc w:val="both"/>
+      </w:pPr>
+      <w:r>
+        <w:t xml:space="preserve">Als ik weet dat we banken gaan koppelen, bereid ik dat onderdeel ook voor. Ik zet een document klaar om direct aantekeningen in te maken. Ik spreek vooraf met mijn collega af hoe we problemen oppakken, zodat we dat niet tijdens de call hoeven te bespreken. En ik bedenk een paar vragen die ik de klant kan stellen als er een moment van wachten ontstaat.</w:t>
+      </w:r>
+    </w:p>
+    <w:p>
+      <w:pPr>
+        <w:spacing w:after="160" w:line="276"/>
+        <w:jc w:val="both"/>
+      </w:pPr>
+      <w:r>
+        <w:t xml:space="preserve">Na de call neem ik vijf minuten om terug te kijken. Heb ik medeleven getoond? Was mijn houding netjes? Heb ik iets dubbel gevraagd? Waren er stiltes die ik had kunnen vullen? Door dat steeds kort na te lopen, wordt het vanzelf een gewoonte.</w:t>
       </w:r>
     </w:p>
     <w:p>
@@ -299,43 +426,34 @@
         <w:pStyle w:val="Heading1"/>
       </w:pPr>
       <w:r>
-        <w:t xml:space="preserve">Wat ik anders had moeten doen</w:t>
-      </w:r>
-    </w:p>
-    <w:p>
-      <w:pPr>
-        <w:spacing w:after="160" w:line="276"/>
-        <w:jc w:val="both"/>
-      </w:pPr>
-      <w:r>
-        <w:t xml:space="preserve">Ik had het gesprek moeten beginnen met een kort praatje. Even vragen hoe zijn dag was, hoe het gaat in de installatiebranche en hoe hij bij ons terecht is gekomen. Dat kost twee minuten en zorgt ervoor dat het gesprek ontspannen begint. Mijn laptop had in die fase dicht moeten blijven.</w:t>
-      </w:r>
-    </w:p>
-    <w:p>
-      <w:pPr>
-        <w:spacing w:after="160" w:line="276"/>
-        <w:jc w:val="both"/>
-      </w:pPr>
-      <w:r>
-        <w:t xml:space="preserve">Daarna had ik hem moeten uitnodigen om zelf te vertellen. Open vragen stellen over zijn bedrijf, zijn ervaringen en zijn verwachtingen. Wat werkt er goed? Waar loopt hij tegenaan? Wat wil hij over een jaar bereikt hebben? Door eerst te luisteren, had ik veel beter kunnen aansluiten bij wat hij nodig heeft.</w:t>
-      </w:r>
-    </w:p>
-    <w:p>
-      <w:pPr>
-        <w:spacing w:after="160" w:line="276"/>
-        <w:jc w:val="both"/>
-      </w:pPr>
-      <w:r>
-        <w:t xml:space="preserve">Toen hij vertelde over Swiftnine en het verkeerde advies, had ik moeten stoppen met mijn eigen verhaal. Erkennen wat hij heeft meegemaakt. Doorvragen naar wat er precies misging en hoe dat voor hem was. Pas daarna had ik kunnen uitleggen hoe wij werken, en dan gericht op precies die punten die bij hem fout gingen: eerlijk advies dat past bij zijn situatie, een structuur die klopt en duidelijke uitleg over de risico’s.</w:t>
-      </w:r>
-    </w:p>
-    <w:p>
-      <w:pPr>
-        <w:spacing w:after="160" w:line="276"/>
-        <w:jc w:val="both"/>
-      </w:pPr>
-      <w:r>
-        <w:t xml:space="preserve">Mijn eigen punten had ik vooraf moeten voorbereiden. Drie kernboodschappen, elk één keer helder gebracht. Dat voorkomt herhaling en geeft rust in het gesprek. Als ik iets moest opzoeken, had ik dat hardop kunnen benoemen en het gesprek ondertussen gaande kunnen houden. Mijn houding had open moeten zijn: rechtop, naar hem toe gericht en met oogcontact, juist op de momenten dat hij iets persoonlijks deelde.</w:t>
+        <w:t xml:space="preserve">Verbeterpunten voor de toekomst</w:t>
+      </w:r>
+    </w:p>
+    <w:p>
+      <w:pPr>
+        <w:spacing w:after="160" w:line="276"/>
+        <w:jc w:val="both"/>
+      </w:pPr>
+      <w:r>
+        <w:t xml:space="preserve">Voor elk volgend gesprek neem ik de volgende punten mee. Voor de call controleer ik mijn camera, mijn beeld en mijn houding. Tijdens de introductie reageer ik actief op wat de klant vertelt en toon ik begrip voor zijn ervaringen, zeker als die negatief zijn. Ik laat met mijn houding en mijn reacties zien dat ik geïnteresseerd ben.</w:t>
+      </w:r>
+    </w:p>
+    <w:p>
+      <w:pPr>
+        <w:spacing w:after="160" w:line="276"/>
+        <w:jc w:val="both"/>
+      </w:pPr>
+      <w:r>
+        <w:t xml:space="preserve">Tijdens praktische onderdelen zoals het koppelen van banken maak ik direct aantekeningen, zodat ik niets dubbel hoef te vragen. Problemen bespreek ik niet met collega’s waar de klant bij is. Ik benoem het probleem rustig en los het na de call op. Stiltes vul ik met een praatje of met uitleg over wat ik aan het doen ben.</w:t>
+      </w:r>
+    </w:p>
+    <w:p>
+      <w:pPr>
+        <w:spacing w:after="160" w:line="276"/>
+        <w:jc w:val="both"/>
+      </w:pPr>
+      <w:r>
+        <w:t xml:space="preserve">Ik wil deze punten niet alleen opschrijven, maar ze ook echt toepassen. Daarom kies ik ervoor om me bij elk gesprek op één of twee punten extra te richten. Zo bouw ik stap voor stap nieuwe gewoontes op. Medeleven tonen en een praatje maken moeten net zo vanzelfsprekend worden als het koppelen van een bankrekening.</w:t>
       </w:r>
     </w:p>
     <w:p>
@@ -343,84 +461,6 @@
         <w:pStyle w:val="Heading1"/>
       </w:pPr>
       <w:r>
-        <w:t xml:space="preserve">Verbeterpunten voor de toekomst</w:t>
-      </w:r>
-    </w:p>
-    <w:p>
-      <w:pPr>
-        <w:spacing w:after="160" w:line="276"/>
-        <w:jc w:val="both"/>
-      </w:pPr>
-      <w:r>
-        <w:t xml:space="preserve">Op basis van dit gesprek neem ik een aantal concrete verbeterpunten mee. Ik bereid elk klantgesprek voor door vooraf drie kernpunten op papier te zetten. Ik begin elk gesprek met een praatje en houd mijn laptop dicht tot ik hem echt nodig heb. Ik stel in elk gesprek minimaal drie open vragen over de klant en zijn bedrijf, en ik laat de klant uitpraten.</w:t>
-      </w:r>
-    </w:p>
-    <w:p>
-      <w:pPr>
-        <w:spacing w:after="160" w:line="276"/>
-        <w:jc w:val="both"/>
-      </w:pPr>
-      <w:r>
-        <w:t xml:space="preserve">Wanneer een klant een slechte ervaring deelt, erken ik die eerst voordat ik met oplossingen kom. Ik let bewust op mijn houding en zorg dat ik naar de klant toe gericht zit. Na elk gesprek neem ik vijf minuten om terug te kijken: heb ik geluisterd, heb ik doorgevraagd en voelde de klant zich gehoord? Ik maak daar een korte notitie van, zodat ik mijn eigen ontwikkeling kan volgen.</w:t>
-      </w:r>
-    </w:p>
-    <w:p>
-      <w:pPr>
-        <w:pStyle w:val="Heading1"/>
-      </w:pPr>
-      <w:r>
-        <w:t xml:space="preserve">Vervolg met Anouar</w:t>
-      </w:r>
-    </w:p>
-    <w:p>
-      <w:pPr>
-        <w:spacing w:after="160" w:line="276"/>
-        <w:jc w:val="both"/>
-      </w:pPr>
-      <w:r>
-        <w:t xml:space="preserve">Ik wil dit gesprek niet als afgesloten beschouwen. Mijn plan is om Anouar deze week te bellen. Niet om alsnog mijn verhaal te doen, maar om hem te bedanken voor zijn openheid en te laten weten dat ik zijn ervaringen serieus neem. Ik wil hem uitnodigen voor een tweede gesprek, waarin hij centraal staat en ik vooral luister.</w:t>
-      </w:r>
-    </w:p>
-    <w:p>
-      <w:pPr>
-        <w:spacing w:after="160" w:line="276"/>
-        <w:jc w:val="both"/>
-      </w:pPr>
-      <w:r>
-        <w:t xml:space="preserve">In dat gesprek wil ik samen met hem kijken naar zijn huidige situatie. Hoe staat zijn administratie ervoor na de overstap? Is de LLC al opgericht en staat er al iets op naam van zijn vriend? Is het bedrijf in Hongkong al geopend? En welke structuur past wel bij zijn bedrijf? Zo kan ik laten zien dat ik niet alleen beloof te luisteren, maar het ook echt doe.</w:t>
-      </w:r>
-    </w:p>
-    <w:p>
-      <w:pPr>
-        <w:pStyle w:val="Heading1"/>
-      </w:pPr>
-      <w:r>
-        <w:t xml:space="preserve">Voorbereiding op het tweede gesprek</w:t>
-      </w:r>
-    </w:p>
-    <w:p>
-      <w:pPr>
-        <w:spacing w:after="160" w:line="276"/>
-        <w:jc w:val="both"/>
-      </w:pPr>
-      <w:r>
-        <w:t xml:space="preserve">Als Anouar ingaat op mijn uitnodiging, wil ik dat gesprek goed voorbereiden. Ik schrijf vooraf op wat ik van het eerste gesprek weet: zijn ervaringen met Swiftnine, het advies over de LLC op naam van zijn vriend, het bedrijf in Hongkong en de omvang van zijn bedrijf. Zo laat ik direct zien dat ik heb onthouden wat hij vertelde.</w:t>
-      </w:r>
-    </w:p>
-    <w:p>
-      <w:pPr>
-        <w:spacing w:after="160" w:line="276"/>
-        <w:jc w:val="both"/>
-      </w:pPr>
-      <w:r>
-        <w:t xml:space="preserve">Ik bereid een aantal open vragen voor. Hoe ziet een gewone werkweek er voor hem uit? Hoeveel tijd besteedt hij zelf aan zijn administratie? Wat verwacht hij van het contact met zijn accountant? En wat zou voor hem het verschil maken ten opzichte van zijn vorige ervaringen? Mijn laptop gebruik ik in dat gesprek alleen als ik hem iets wil laten zien.</w:t>
-      </w:r>
-    </w:p>
-    <w:p>
-      <w:pPr>
-        <w:pStyle w:val="Heading1"/>
-      </w:pPr>
-      <w:r>
         <w:t xml:space="preserve">Conclusie</w:t>
       </w:r>
     </w:p>
@@ -430,25 +470,25 @@
         <w:jc w:val="both"/>
       </w:pPr>
       <w:r>
-        <w:t xml:space="preserve">Het gesprek met Anouar liep niet zoals het had moeten lopen. Ik heb te weinig geluisterd, geen medeleven getoond, weinig interesse laten zien, stiltes laten vallen door mijn laptop, mezelf herhaald en een houding aangenomen die niet professioneel was. Dat is niet fijn om op te schrijven, maar het is wel eerlijk.</w:t>
-      </w:r>
-    </w:p>
-    <w:p>
-      <w:pPr>
-        <w:spacing w:after="160" w:line="276"/>
-        <w:jc w:val="both"/>
-      </w:pPr>
-      <w:r>
-        <w:t xml:space="preserve">Tegelijkertijd zie ik dit gesprek als een waardevol leermoment. Het laat precies zien waar mijn verbeterpunten liggen. Een klant komt niet alleen voor kennis. Een klant komt voor aandacht, begrip en vertrouwen. Dat begint bij luisteren.</w:t>
-      </w:r>
-    </w:p>
-    <w:p>
-      <w:pPr>
-        <w:spacing w:after="160" w:line="276"/>
-        <w:jc w:val="both"/>
-      </w:pPr>
-      <w:r>
-        <w:t xml:space="preserve">Ik neem deze lessen mee naar elk volgend gesprek. En ik hoop dat ik Anouar alsnog kan laten zien dat hij bij ons wel gehoord wordt.</w:t>
+        <w:t xml:space="preserve">Het gesprek met Anouar liep niet zoals het had moeten lopen. In de introductie toonde ik geen medeleven, was mijn houding niet netjes, was mijn camera niet schoon en kwam ik over alsof ik geen interesse had. Bij het koppelen van de banken vroeg ik drie keer hetzelfde, discussieerde ik met mijn collega waar de klant bij was en vielen er veel stiltes.</w:t>
+      </w:r>
+    </w:p>
+    <w:p>
+      <w:pPr>
+        <w:spacing w:after="160" w:line="276"/>
+        <w:jc w:val="both"/>
+      </w:pPr>
+      <w:r>
+        <w:t xml:space="preserve">Geen van deze fouten kwam voort uit een gebrek aan kennis. Ze kwamen voort uit een gebrek aan aandacht en voorbereiding. Juist daarom zijn ze goed op te lossen. Een schone camera, een nette houding, een korte erkenning van wat de klant vertelt en een praatje tijdens het wachten maken samen het verschil tussen een rommelig gesprek en een professioneel gesprek.</w:t>
+      </w:r>
+    </w:p>
+    <w:p>
+      <w:pPr>
+        <w:spacing w:after="160" w:line="276"/>
+        <w:jc w:val="both"/>
+      </w:pPr>
+      <w:r>
+        <w:t xml:space="preserve">Dit had ik allemaal kunnen voorkomen. Dat is de belangrijkste les uit dit gesprek. Ik neem deze lessen mee naar elk volgend gesprek, zodat de klant zich vanaf de eerste minuut gehoord en serieus genomen voelt.</w:t>
       </w:r>
     </w:p>
     <w:sectPr>
@@ -870,5 +910,25 @@
       <w:szCs w:val="26"/>
     </w:rPr>
   </w:style>
+  <w:style w:type="paragraph" w:styleId="Heading2">
+    <w:name w:val="Heading 2"/>
+    <w:basedOn w:val="Normal"/>
+    <w:next w:val="Normal"/>
+    <w:qFormat/>
+    <w:pPr>
+      <w:keepNext/>
+      <w:spacing w:after="80" w:before="160"/>
+      <w:outlineLvl w:val="1"/>
+    </w:pPr>
+    <w:rPr>
+      <w:rFonts w:ascii="Arial" w:cs="Arial" w:eastAsia="Arial" w:hAnsi="Arial"/>
+      <w:b/>
+      <w:bCs/>
+      <w:i/>
+      <w:iCs/>
+      <w:sz w:val="22"/>
+      <w:szCs w:val="22"/>
+    </w:rPr>
+  </w:style>
 </w:styles>
 </file>
</xml_diff>

<commit_message>
Verslag naar 2 volle pagina's, zonder toegevoegde inhoud
Co-Authored-By: Claude Opus 5.5 <noreply@anthropic.com>
Claude-Session: https://claude.ai/code/session_01EPbmVSJZpU3ZYgYyjANTDJ
</commit_message>
<xml_diff>
--- a/Verslag_klantgesprek_Anouar.docx
+++ b/Verslag_klantgesprek_Anouar.docx
@@ -28,10 +28,29 @@
     </w:p>
     <w:p>
       <w:pPr>
-        <w:spacing w:after="160" w:line="276"/>
-      </w:pPr>
-      <w:r>
-        <w:t xml:space="preserve">Anouar vertelde over zijn slechte ervaring met zijn vorige accountant, Swiftnine. Zij hebben hem verteld om een LLC op naam van zijn vriend te zetten als nominee en om een bedrijf in Hongkong te openen. Daarnaast vertelde hij dat een accountant hem geen goed advies gaf.</w:t>
+        <w:spacing w:after="240" w:line="380"/>
+        <w:jc w:val="both"/>
+      </w:pPr>
+      <w:r>
+        <w:t xml:space="preserve">In dit verslag kijk ik terug op mijn gesprek met Anouar. Het gesprek bestond uit twee delen: de introductie en het koppelen van de banken. In beide delen ging er iets mis.</w:t>
+      </w:r>
+    </w:p>
+    <w:p>
+      <w:pPr>
+        <w:spacing w:after="240" w:line="380"/>
+        <w:jc w:val="both"/>
+      </w:pPr>
+      <w:r>
+        <w:t xml:space="preserve">Anouar vertelde mij over zijn slechte ervaring met zijn vorige accountant, Swiftnine. Swiftnine heeft hem verteld om een LLC op naam van zijn vriend te zetten, waarbij zijn vriend als nominee zou optreden. Daarnaast hebben zij hem verteld om een bedrijf in Hongkong te openen.</w:t>
+      </w:r>
+    </w:p>
+    <w:p>
+      <w:pPr>
+        <w:spacing w:after="240" w:line="380"/>
+        <w:jc w:val="both"/>
+      </w:pPr>
+      <w:r>
+        <w:t xml:space="preserve">Ook vertelde Anouar dat een accountant hem geen goed advies heeft gegeven. Hij deelde dus zijn eerdere ervaringen met mij, en die ervaringen waren niet goed.</w:t>
       </w:r>
     </w:p>
     <w:p>
@@ -44,23 +63,44 @@
     </w:p>
     <w:p>
       <w:pPr>
-        <w:spacing w:after="160" w:line="276"/>
-      </w:pPr>
-      <w:r>
-        <w:t xml:space="preserve">Ik ben de call begonnen met de vraag hoe het ging. Daarna heb ik gezegd dat hij kon starten met het uitleggen van zijn situatie. Dat heeft hij gedaan.</w:t>
-      </w:r>
-    </w:p>
-    <w:p>
-      <w:pPr>
-        <w:spacing w:after="160" w:line="276"/>
-      </w:pPr>
-      <w:r>
-        <w:t xml:space="preserve">Mijn probleem was dat ik geen medeleven toonde over zijn ervaring. Daarnaast was mijn houding niet netjes. Mijn camera was niet schoon. Ik kwam over alsof ik geen interesse had in het verhaal van Anouar.</w:t>
-      </w:r>
-    </w:p>
-    <w:p>
-      <w:pPr>
-        <w:spacing w:after="160" w:line="276"/>
+        <w:spacing w:after="240" w:line="380"/>
+        <w:jc w:val="both"/>
+      </w:pPr>
+      <w:r>
+        <w:t xml:space="preserve">Ik ben de call begonnen met de vraag hoe het met Anouar ging. Daarna heb ik gezegd dat hij kon starten met het uitleggen van zijn situatie. Dat heeft hij gedaan. Hij heeft mij uitgelegd hoe zijn situatie eruitziet en wat hij heeft meegemaakt.</w:t>
+      </w:r>
+    </w:p>
+    <w:p>
+      <w:pPr>
+        <w:spacing w:after="240" w:line="380"/>
+        <w:jc w:val="both"/>
+      </w:pPr>
+      <w:r>
+        <w:t xml:space="preserve">Mijn probleem was dat ik geen medeleven toonde over zijn ervaring. Anouar vertelde over zijn slechte ervaring, maar ik reageerde daar niet met medeleven op.</w:t>
+      </w:r>
+    </w:p>
+    <w:p>
+      <w:pPr>
+        <w:spacing w:after="240" w:line="380"/>
+        <w:jc w:val="both"/>
+      </w:pPr>
+      <w:r>
+        <w:t xml:space="preserve">Daarnaast was mijn houding niet netjes. Ook mijn camera was niet schoon. Door mijn houding kwam ik over alsof ik geen interesse had in het verhaal van Anouar.</w:t>
+      </w:r>
+    </w:p>
+    <w:p>
+      <w:pPr>
+        <w:spacing w:after="240" w:line="380"/>
+        <w:jc w:val="both"/>
+      </w:pPr>
+      <w:r>
+        <w:t xml:space="preserve">Ik had meer moeten luisteren naar Anouar en medeleven moeten tonen. Mijn houding had netjes moeten zijn en mijn camera had schoon moeten zijn.</w:t>
+      </w:r>
+    </w:p>
+    <w:p>
+      <w:pPr>
+        <w:spacing w:after="240" w:line="380"/>
+        <w:jc w:val="both"/>
       </w:pPr>
       <w:r>
         <w:t xml:space="preserve">Dit had ik kunnen voorkomen.</w:t>
@@ -76,31 +116,44 @@
     </w:p>
     <w:p>
       <w:pPr>
-        <w:spacing w:after="160" w:line="276"/>
-      </w:pPr>
-      <w:r>
-        <w:t xml:space="preserve">Tijdens het koppelen van de banken heb ik hem drie keer hetzelfde gevraagd. Dat was onprofessioneel.</w:t>
-      </w:r>
-    </w:p>
-    <w:p>
-      <w:pPr>
-        <w:spacing w:after="160" w:line="276"/>
-      </w:pPr>
-      <w:r>
-        <w:t xml:space="preserve">Daarnaast zat ik met mijn collega te discussiëren over problemen die tevoorschijn kwamen. Dat was ook niet goed.</w:t>
-      </w:r>
-    </w:p>
-    <w:p>
-      <w:pPr>
-        <w:spacing w:after="160" w:line="276"/>
-      </w:pPr>
-      <w:r>
-        <w:t xml:space="preserve">Er vielen veel stiltes, terwijl ik een praatje had kunnen maken om de stilte te vullen.</w:t>
-      </w:r>
-    </w:p>
-    <w:p>
-      <w:pPr>
-        <w:spacing w:after="160" w:line="276"/>
+        <w:spacing w:after="240" w:line="380"/>
+        <w:jc w:val="both"/>
+      </w:pPr>
+      <w:r>
+        <w:t xml:space="preserve">Na de introductie gingen we de banken koppelen. Tijdens het koppelen van de banken heb ik Anouar drie keer hetzelfde gevraagd. Dat was onprofessioneel.</w:t>
+      </w:r>
+    </w:p>
+    <w:p>
+      <w:pPr>
+        <w:spacing w:after="240" w:line="380"/>
+        <w:jc w:val="both"/>
+      </w:pPr>
+      <w:r>
+        <w:t xml:space="preserve">Daarnaast zat ik tijdens het koppelen met mijn collega te discussiëren over problemen die tevoorschijn kwamen. Dat gebeurde terwijl Anouar in de call zat. Dat was ook niet goed.</w:t>
+      </w:r>
+    </w:p>
+    <w:p>
+      <w:pPr>
+        <w:spacing w:after="240" w:line="380"/>
+        <w:jc w:val="both"/>
+      </w:pPr>
+      <w:r>
+        <w:t xml:space="preserve">Ook waren er heel veel stiltes tijdens het koppelen van de banken. In die stiltes had ik een praatje met Anouar kunnen maken om de stilte te vullen. Dat heb ik niet gedaan.</w:t>
+      </w:r>
+    </w:p>
+    <w:p>
+      <w:pPr>
+        <w:spacing w:after="240" w:line="380"/>
+        <w:jc w:val="both"/>
+      </w:pPr>
+      <w:r>
+        <w:t xml:space="preserve">Ik had hem niet drie keer hetzelfde moeten vragen. Ik had niet met mijn collega moeten discussiëren tijdens de call. En ik had een praatje moeten maken in plaats van stiltes te laten vallen.</w:t>
+      </w:r>
+    </w:p>
+    <w:p>
+      <w:pPr>
+        <w:spacing w:after="240" w:line="380"/>
+        <w:jc w:val="both"/>
       </w:pPr>
       <w:r>
         <w:t xml:space="preserve">Dit had ik kunnen voorkomen.</w:t>
@@ -116,10 +169,56 @@
     </w:p>
     <w:p>
       <w:pPr>
-        <w:spacing w:after="160" w:line="276"/>
-      </w:pPr>
-      <w:r>
-        <w:t xml:space="preserve">Ik had meer moeten luisteren naar Anouar en medeleven moeten tonen. In plaats van stiltes te laten vallen, had ik gewoon een praatje moeten maken.</w:t>
+        <w:spacing w:after="240" w:line="380"/>
+        <w:jc w:val="both"/>
+      </w:pPr>
+      <w:r>
+        <w:t xml:space="preserve">Als ik terugkijk op het hele gesprek, zijn dit de punten die beter konden:</w:t>
+      </w:r>
+    </w:p>
+    <w:p>
+      <w:pPr>
+        <w:spacing w:after="240" w:line="380"/>
+        <w:jc w:val="both"/>
+      </w:pPr>
+      <w:r>
+        <w:t xml:space="preserve">Ik had meer moeten luisteren naar Anouar en medeleven moeten tonen over zijn ervaring met Swiftnine en het advies dat hij heeft gekregen.</w:t>
+      </w:r>
+    </w:p>
+    <w:p>
+      <w:pPr>
+        <w:spacing w:after="240" w:line="380"/>
+        <w:jc w:val="both"/>
+      </w:pPr>
+      <w:r>
+        <w:t xml:space="preserve">Mijn houding had netjes moeten zijn en mijn camera had schoon moeten zijn, zodat ik niet overkwam alsof ik geen interesse had.</w:t>
+      </w:r>
+    </w:p>
+    <w:p>
+      <w:pPr>
+        <w:spacing w:after="240" w:line="380"/>
+        <w:jc w:val="both"/>
+      </w:pPr>
+      <w:r>
+        <w:t xml:space="preserve">Ik had Anouar niet drie keer hetzelfde moeten vragen en ik had niet met mijn collega moeten discussiëren over de problemen terwijl hij erbij was.</w:t>
+      </w:r>
+    </w:p>
+    <w:p>
+      <w:pPr>
+        <w:spacing w:after="240" w:line="380"/>
+        <w:jc w:val="both"/>
+      </w:pPr>
+      <w:r>
+        <w:t xml:space="preserve">In plaats van stiltes te laten vallen, had ik gewoon een praatje moeten maken.</w:t>
+      </w:r>
+    </w:p>
+    <w:p>
+      <w:pPr>
+        <w:spacing w:after="240" w:line="380"/>
+        <w:jc w:val="both"/>
+      </w:pPr>
+      <w:r>
+        <w:t xml:space="preserve">Dit had ik allemaal kunnen voorkomen.</w:t>
       </w:r>
     </w:p>
     <w:sectPr>
@@ -311,8 +410,8 @@
     <w:rPrDefault>
       <w:rPr>
         <w:rFonts w:ascii="Arial" w:cs="Arial" w:eastAsia="Arial" w:hAnsi="Arial"/>
-        <w:sz w:val="22"/>
-        <w:szCs w:val="22"/>
+        <w:sz w:val="26"/>
+        <w:szCs w:val="26"/>
       </w:rPr>
     </w:rPrDefault>
     <w:pPrDefault/>
@@ -498,8 +597,8 @@
       <w:rFonts w:ascii="Arial" w:cs="Arial" w:eastAsia="Arial" w:hAnsi="Arial"/>
       <w:b/>
       <w:bCs/>
-      <w:sz w:val="36"/>
-      <w:szCs w:val="36"/>
+      <w:sz w:val="40"/>
+      <w:szCs w:val="40"/>
     </w:rPr>
   </w:style>
   <w:style w:type="paragraph" w:styleId="Heading1">
@@ -509,15 +608,15 @@
     <w:qFormat/>
     <w:pPr>
       <w:keepNext/>
-      <w:spacing w:after="120" w:before="280"/>
+      <w:spacing w:after="160" w:before="360"/>
       <w:outlineLvl w:val="0"/>
     </w:pPr>
     <w:rPr>
       <w:rFonts w:ascii="Arial" w:cs="Arial" w:eastAsia="Arial" w:hAnsi="Arial"/>
       <w:b/>
       <w:bCs/>
-      <w:sz w:val="26"/>
-      <w:szCs w:val="26"/>
+      <w:sz w:val="30"/>
+      <w:szCs w:val="30"/>
     </w:rPr>
   </w:style>
 </w:styles>

</xml_diff>